<commit_message>
Add comparison table to IV.D.
</commit_message>
<xml_diff>
--- a/paper/IEEE-Access-Response-to-Reviewers.docx
+++ b/paper/IEEE-Access-Response-to-Reviewers.docx
@@ -1,6 +1,6 @@
 
 <file path=word/document.xml><?xml version="1.0" encoding="utf-8"?>
-<w:document xmlns:wpc="http://schemas.microsoft.com/office/word/2010/wordprocessingCanvas" xmlns:cx="http://schemas.microsoft.com/office/drawing/2014/chartex" xmlns:cx1="http://schemas.microsoft.com/office/drawing/2015/9/8/chartex" xmlns:cx2="http://schemas.microsoft.com/office/drawing/2015/10/21/chartex" xmlns:cx3="http://schemas.microsoft.com/office/drawing/2016/5/9/chartex" xmlns:cx4="http://schemas.microsoft.com/office/drawing/2016/5/10/chartex" xmlns:cx5="http://schemas.microsoft.com/office/drawing/2016/5/11/chartex" xmlns:cx6="http://schemas.microsoft.com/office/drawing/2016/5/12/chartex" xmlns:cx7="http://schemas.microsoft.com/office/drawing/2016/5/13/chartex" xmlns:cx8="http://schemas.microsoft.com/office/drawing/2016/5/14/chartex" xmlns:mc="http://schemas.openxmlformats.org/markup-compatibility/2006" xmlns:aink="http://schemas.microsoft.com/office/drawing/2016/ink" xmlns:am3d="http://schemas.microsoft.com/office/drawing/2017/model3d" xmlns:o="urn:schemas-microsoft-com:office:office" xmlns:oel="http://schemas.microsoft.com/office/2019/extlst" xmlns:r="http://schemas.openxmlformats.org/officeDocument/2006/relationships" xmlns:m="http://schemas.openxmlformats.org/officeDocument/2006/math" xmlns:v="urn:schemas-microsoft-com:vml" xmlns:wp14="http://schemas.microsoft.com/office/word/2010/wordprocessingDrawing" xmlns:wp="http://schemas.openxmlformats.org/drawingml/2006/wordprocessingDrawing" xmlns:w10="urn:schemas-microsoft-com:office:word" xmlns:w="http://schemas.openxmlformats.org/wordprocessingml/2006/main" xmlns:w14="http://schemas.microsoft.com/office/word/2010/wordml" xmlns:w15="http://schemas.microsoft.com/office/word/2012/wordml" xmlns:w16cex="http://schemas.microsoft.com/office/word/2018/wordml/cex" xmlns:w16cid="http://schemas.microsoft.com/office/word/2016/wordml/cid" xmlns:w16="http://schemas.microsoft.com/office/word/2018/wordml" xmlns:w16du="http://schemas.microsoft.com/office/word/2023/wordml/word16du" xmlns:w16sdtdh="http://schemas.microsoft.com/office/word/2020/wordml/sdtdatahash" xmlns:w16sdtfl="http://schemas.microsoft.com/office/word/2024/wordml/sdtformatlock" xmlns:w16se="http://schemas.microsoft.com/office/word/2015/wordml/symex" xmlns:wpg="http://schemas.microsoft.com/office/word/2010/wordprocessingGroup" xmlns:wpi="http://schemas.microsoft.com/office/word/2010/wordprocessingInk" xmlns:wne="http://schemas.microsoft.com/office/word/2006/wordml" xmlns:wps="http://schemas.microsoft.com/office/word/2010/wordprocessingShape" mc:Ignorable="w14 w15 w16se w16cid w16 w16cex w16sdtdh w16sdtfl w16du wp14">
+<w:document xmlns:wpc="http://schemas.microsoft.com/office/word/2010/wordprocessingCanvas" xmlns:cx="http://schemas.microsoft.com/office/drawing/2014/chartex" xmlns:cx1="http://schemas.microsoft.com/office/drawing/2015/9/8/chartex" xmlns:cx2="http://schemas.microsoft.com/office/drawing/2015/10/21/chartex" xmlns:cx3="http://schemas.microsoft.com/office/drawing/2016/5/9/chartex" xmlns:cx4="http://schemas.microsoft.com/office/drawing/2016/5/10/chartex" xmlns:cx5="http://schemas.microsoft.com/office/drawing/2016/5/11/chartex" xmlns:cx6="http://schemas.microsoft.com/office/drawing/2016/5/12/chartex" xmlns:cx7="http://schemas.microsoft.com/office/drawing/2016/5/13/chartex" xmlns:cx8="http://schemas.microsoft.com/office/drawing/2016/5/14/chartex" xmlns:mc="http://schemas.openxmlformats.org/markup-compatibility/2006" xmlns:aink="http://schemas.microsoft.com/office/drawing/2016/ink" xmlns:am3d="http://schemas.microsoft.com/office/drawing/2017/model3d" xmlns:o="urn:schemas-microsoft-com:office:office" xmlns:oel="http://schemas.microsoft.com/office/2019/extlst" xmlns:r="http://schemas.openxmlformats.org/officeDocument/2006/relationships" xmlns:m="http://schemas.openxmlformats.org/officeDocument/2006/math" xmlns:v="urn:schemas-microsoft-com:vml" xmlns:wp14="http://schemas.microsoft.com/office/word/2010/wordprocessingDrawing" xmlns:wp="http://schemas.openxmlformats.org/drawingml/2006/wordprocessingDrawing" xmlns:w10="urn:schemas-microsoft-com:office:word" xmlns:w="http://schemas.openxmlformats.org/wordprocessingml/2006/main" xmlns:w14="http://schemas.microsoft.com/office/word/2010/wordml" xmlns:w15="http://schemas.microsoft.com/office/word/2012/wordml" xmlns:w16cei="http://schemas.microsoft.com/office/word/2026/wordml/cei" xmlns:w16cex="http://schemas.microsoft.com/office/word/2018/wordml/cex" xmlns:w16cid="http://schemas.microsoft.com/office/word/2016/wordml/cid" xmlns:w16="http://schemas.microsoft.com/office/word/2018/wordml" xmlns:w16du="http://schemas.microsoft.com/office/word/2023/wordml/word16du" xmlns:w16sdtdh="http://schemas.microsoft.com/office/word/2020/wordml/sdtdatahash" xmlns:w16sdtfl="http://schemas.microsoft.com/office/word/2024/wordml/sdtformatlock" xmlns:w16se="http://schemas.microsoft.com/office/word/2015/wordml/symex" xmlns:wpg="http://schemas.microsoft.com/office/word/2010/wordprocessingGroup" xmlns:wpi="http://schemas.microsoft.com/office/word/2010/wordprocessingInk" xmlns:wne="http://schemas.microsoft.com/office/word/2006/wordml" xmlns:wps="http://schemas.microsoft.com/office/word/2010/wordprocessingShape" mc:Ignorable="w14 w15 w16se w16cid w16 w16cex w16sdtdh w16sdtfl w16du wp14">
   <w:body>
     <w:p>
       <w:pPr>
@@ -801,6 +801,7 @@
           <w:rFonts w:ascii="Calibri" w:hAnsi="Calibri"/>
           <w:b/>
           <w:bCs/>
+          <w:strike/>
           <w:color w:val="008000"/>
           <w:sz w:val="22"/>
           <w:szCs w:val="22"/>
@@ -813,6 +814,7 @@
           <w:rFonts w:ascii="Calibri" w:hAnsi="Calibri"/>
           <w:b/>
           <w:bCs/>
+          <w:strike/>
           <w:color w:val="008000"/>
           <w:sz w:val="22"/>
           <w:szCs w:val="22"/>
@@ -824,11 +826,23 @@
           <w:rFonts w:ascii="Calibri" w:hAnsi="Calibri"/>
           <w:b/>
           <w:bCs/>
-          <w:color w:val="008000"/>
-          <w:sz w:val="22"/>
-          <w:szCs w:val="22"/>
-        </w:rPr>
-        <w:t xml:space="preserve"> (</w:t>
+          <w:strike/>
+          <w:color w:val="008000"/>
+          <w:sz w:val="22"/>
+          <w:szCs w:val="22"/>
+        </w:rPr>
+        <w:t xml:space="preserve"> </w:t>
+      </w:r>
+      <w:r>
+        <w:rPr>
+          <w:rFonts w:ascii="Calibri" w:hAnsi="Calibri"/>
+          <w:b/>
+          <w:bCs/>
+          <w:color w:val="008000"/>
+          <w:sz w:val="22"/>
+          <w:szCs w:val="22"/>
+        </w:rPr>
+        <w:t>(</w:t>
       </w:r>
       <w:r>
         <w:rPr>
@@ -923,16 +937,202 @@
           <w:sz w:val="22"/>
           <w:szCs w:val="22"/>
         </w:rPr>
-        <w:t>We add a table comparing our 5-unit-cell long-pass edge-filter design to other PCM-based optical filter designs at the IV.C RESULTS &amp; DISCUSSIONS.</w:t>
-      </w:r>
-    </w:p>
-    <w:p>
-      <w:pPr>
-        <w:jc w:val="both"/>
-        <w:rPr>
-          <w:rFonts w:ascii="Calibri" w:hAnsi="Calibri"/>
-          <w:sz w:val="22"/>
-          <w:szCs w:val="22"/>
+        <w:t>We add a table comparing our 5-unit-cell long-pass edge-filter design</w:t>
+      </w:r>
+      <w:r>
+        <w:rPr>
+          <w:rFonts w:ascii="Calibri" w:hAnsi="Calibri"/>
+          <w:sz w:val="22"/>
+          <w:szCs w:val="22"/>
+        </w:rPr>
+        <w:t>s</w:t>
+      </w:r>
+      <w:r>
+        <w:rPr>
+          <w:rFonts w:ascii="Calibri" w:hAnsi="Calibri"/>
+          <w:sz w:val="22"/>
+          <w:szCs w:val="22"/>
+        </w:rPr>
+        <w:t xml:space="preserve"> to other </w:t>
+      </w:r>
+      <w:r>
+        <w:rPr>
+          <w:rFonts w:ascii="Calibri" w:hAnsi="Calibri"/>
+          <w:sz w:val="22"/>
+          <w:szCs w:val="22"/>
+        </w:rPr>
+        <w:t xml:space="preserve">optical devices </w:t>
+      </w:r>
+      <w:r>
+        <w:rPr>
+          <w:rFonts w:ascii="Calibri" w:hAnsi="Calibri"/>
+          <w:sz w:val="22"/>
+          <w:szCs w:val="22"/>
+        </w:rPr>
+        <w:t xml:space="preserve">at the </w:t>
+      </w:r>
+      <w:r>
+        <w:rPr>
+          <w:rFonts w:ascii="Calibri" w:hAnsi="Calibri"/>
+          <w:sz w:val="22"/>
+          <w:szCs w:val="22"/>
+        </w:rPr>
+        <w:t>“</w:t>
+      </w:r>
+      <w:r>
+        <w:rPr>
+          <w:rFonts w:ascii="Calibri" w:hAnsi="Calibri"/>
+          <w:sz w:val="22"/>
+          <w:szCs w:val="22"/>
+        </w:rPr>
+        <w:t>IV.</w:t>
+      </w:r>
+      <w:r>
+        <w:rPr>
+          <w:rFonts w:ascii="Calibri" w:hAnsi="Calibri"/>
+          <w:sz w:val="22"/>
+          <w:szCs w:val="22"/>
+        </w:rPr>
+        <w:t>D</w:t>
+      </w:r>
+      <w:r>
+        <w:rPr>
+          <w:rFonts w:ascii="Calibri" w:hAnsi="Calibri"/>
+          <w:sz w:val="22"/>
+          <w:szCs w:val="22"/>
+        </w:rPr>
+        <w:t xml:space="preserve"> RESULTS &amp; DISCUSSIONS</w:t>
+      </w:r>
+      <w:r>
+        <w:rPr>
+          <w:rFonts w:ascii="Calibri" w:hAnsi="Calibri"/>
+          <w:sz w:val="22"/>
+          <w:szCs w:val="22"/>
+        </w:rPr>
+        <w:t>”</w:t>
+      </w:r>
+      <w:r>
+        <w:rPr>
+          <w:rFonts w:ascii="Calibri" w:hAnsi="Calibri"/>
+          <w:sz w:val="22"/>
+          <w:szCs w:val="22"/>
+        </w:rPr>
+        <w:t>.</w:t>
+      </w:r>
+      <w:r>
+        <w:rPr>
+          <w:rFonts w:ascii="Calibri" w:hAnsi="Calibri"/>
+          <w:sz w:val="22"/>
+          <w:szCs w:val="22"/>
+        </w:rPr>
+        <w:t xml:space="preserve"> It should be noted that only one reference can be directly compared (Ref. [16]; Sb</w:t>
+      </w:r>
+      <w:r>
+        <w:rPr>
+          <w:rFonts w:ascii="Calibri" w:hAnsi="Calibri"/>
+          <w:sz w:val="22"/>
+          <w:szCs w:val="22"/>
+          <w:vertAlign w:val="subscript"/>
+        </w:rPr>
+        <w:t>2</w:t>
+      </w:r>
+      <w:r>
+        <w:rPr>
+          <w:rFonts w:ascii="Calibri" w:hAnsi="Calibri"/>
+          <w:sz w:val="22"/>
+          <w:szCs w:val="22"/>
+        </w:rPr>
+        <w:t>Se</w:t>
+      </w:r>
+      <w:r>
+        <w:rPr>
+          <w:rFonts w:ascii="Calibri" w:hAnsi="Calibri"/>
+          <w:sz w:val="22"/>
+          <w:szCs w:val="22"/>
+          <w:vertAlign w:val="subscript"/>
+        </w:rPr>
+        <w:t>3</w:t>
+      </w:r>
+      <w:r>
+        <w:rPr>
+          <w:rFonts w:ascii="Calibri" w:hAnsi="Calibri"/>
+          <w:sz w:val="22"/>
+          <w:szCs w:val="22"/>
+        </w:rPr>
+        <w:t xml:space="preserve">-based at </w:t>
+      </w:r>
+      <w:r>
+        <w:rPr>
+          <w:rFonts w:ascii="Calibri" w:hAnsi="Calibri"/>
+          <w:sz w:val="22"/>
+          <w:szCs w:val="22"/>
+        </w:rPr>
+        <w:t>similar</w:t>
+      </w:r>
+      <w:r>
+        <w:rPr>
+          <w:rFonts w:ascii="Calibri" w:hAnsi="Calibri"/>
+          <w:sz w:val="22"/>
+          <w:szCs w:val="22"/>
+        </w:rPr>
+        <w:t xml:space="preserve"> operating wavelength), and </w:t>
+      </w:r>
+      <w:r>
+        <w:rPr>
+          <w:rFonts w:ascii="Calibri" w:hAnsi="Calibri"/>
+          <w:sz w:val="22"/>
+          <w:szCs w:val="22"/>
+          <w:highlight w:val="yellow"/>
+        </w:rPr>
+        <w:t xml:space="preserve">some references did not </w:t>
+      </w:r>
+      <w:r>
+        <w:rPr>
+          <w:rFonts w:ascii="Calibri" w:hAnsi="Calibri"/>
+          <w:sz w:val="22"/>
+          <w:szCs w:val="22"/>
+          <w:highlight w:val="yellow"/>
+        </w:rPr>
+        <w:t>provide</w:t>
+      </w:r>
+      <w:r>
+        <w:rPr>
+          <w:rFonts w:ascii="Calibri" w:hAnsi="Calibri"/>
+          <w:sz w:val="22"/>
+          <w:szCs w:val="22"/>
+          <w:highlight w:val="yellow"/>
+        </w:rPr>
+        <w:t xml:space="preserve"> </w:t>
+      </w:r>
+      <w:r>
+        <w:rPr>
+          <w:rFonts w:ascii="Calibri" w:hAnsi="Calibri"/>
+          <w:sz w:val="22"/>
+          <w:szCs w:val="22"/>
+          <w:highlight w:val="yellow"/>
+        </w:rPr>
+        <w:t>transmittance value shown</w:t>
+      </w:r>
+      <w:r>
+        <w:rPr>
+          <w:rFonts w:ascii="Calibri" w:hAnsi="Calibri"/>
+          <w:sz w:val="22"/>
+          <w:szCs w:val="22"/>
+          <w:highlight w:val="yellow"/>
+        </w:rPr>
+        <w:t xml:space="preserve"> in their figures, we interpolate these missing data using ImageJ.</w:t>
+      </w:r>
+    </w:p>
+    <w:p>
+      <w:pPr>
+        <w:jc w:val="both"/>
+        <w:rPr>
+          <w:rFonts w:ascii="Calibri" w:hAnsi="Calibri" w:cstheme="minorBidi" w:hint="cs"/>
+          <w:bCs/>
+          <w:sz w:val="22"/>
+          <w:szCs w:val="28"/>
+          <w:cs/>
+          <w:lang w:bidi="th-TH"/>
         </w:rPr>
       </w:pPr>
       <w:r>
@@ -943,6 +1143,150 @@
           <w:szCs w:val="22"/>
         </w:rPr>
         <w:t>Author action:</w:t>
+      </w:r>
+      <w:r>
+        <w:rPr>
+          <w:rFonts w:ascii="Calibri" w:hAnsi="Calibri"/>
+          <w:b/>
+          <w:sz w:val="22"/>
+          <w:szCs w:val="22"/>
+        </w:rPr>
+        <w:t xml:space="preserve"> </w:t>
+      </w:r>
+      <w:r>
+        <w:rPr>
+          <w:rFonts w:ascii="Calibri" w:hAnsi="Calibri"/>
+          <w:bCs/>
+          <w:sz w:val="22"/>
+          <w:szCs w:val="22"/>
+        </w:rPr>
+        <w:t xml:space="preserve">To this and similar concern, we add </w:t>
+      </w:r>
+      <w:r>
+        <w:rPr>
+          <w:rFonts w:ascii="Calibri" w:hAnsi="Calibri"/>
+          <w:bCs/>
+          <w:sz w:val="22"/>
+          <w:szCs w:val="22"/>
+        </w:rPr>
+        <w:t xml:space="preserve">addition </w:t>
+      </w:r>
+      <w:r>
+        <w:rPr>
+          <w:rFonts w:ascii="Calibri" w:hAnsi="Calibri"/>
+          <w:bCs/>
+          <w:sz w:val="22"/>
+          <w:szCs w:val="22"/>
+        </w:rPr>
+        <w:t>section</w:t>
+      </w:r>
+      <w:r>
+        <w:rPr>
+          <w:rFonts w:ascii="Calibri" w:hAnsi="Calibri"/>
+          <w:bCs/>
+          <w:sz w:val="22"/>
+          <w:szCs w:val="22"/>
+        </w:rPr>
+        <w:t xml:space="preserve"> titled</w:t>
+      </w:r>
+      <w:r>
+        <w:rPr>
+          <w:rFonts w:ascii="Calibri" w:hAnsi="Calibri"/>
+          <w:bCs/>
+          <w:sz w:val="22"/>
+          <w:szCs w:val="22"/>
+        </w:rPr>
+        <w:t xml:space="preserve"> </w:t>
+      </w:r>
+      <w:r>
+        <w:rPr>
+          <w:rFonts w:ascii="Calibri" w:hAnsi="Calibri"/>
+          <w:bCs/>
+          <w:sz w:val="22"/>
+          <w:szCs w:val="22"/>
+        </w:rPr>
+        <w:t>“</w:t>
+      </w:r>
+      <w:r>
+        <w:rPr>
+          <w:rFonts w:ascii="Calibri" w:hAnsi="Calibri"/>
+          <w:bCs/>
+          <w:sz w:val="22"/>
+          <w:szCs w:val="22"/>
+        </w:rPr>
+        <w:t>IV.D. COMPARISON WITH OTHER OPTICAL DEVICES</w:t>
+      </w:r>
+      <w:r>
+        <w:rPr>
+          <w:rFonts w:ascii="Calibri" w:hAnsi="Calibri"/>
+          <w:bCs/>
+          <w:sz w:val="22"/>
+          <w:szCs w:val="22"/>
+        </w:rPr>
+        <w:t>”</w:t>
+      </w:r>
+      <w:r>
+        <w:rPr>
+          <w:rFonts w:ascii="Calibri" w:hAnsi="Calibri"/>
+          <w:bCs/>
+          <w:sz w:val="22"/>
+          <w:szCs w:val="22"/>
+        </w:rPr>
+        <w:t>.</w:t>
+      </w:r>
+      <w:r>
+        <w:rPr>
+          <w:rFonts w:ascii="Calibri" w:hAnsi="Calibri"/>
+          <w:bCs/>
+          <w:sz w:val="22"/>
+          <w:szCs w:val="22"/>
+        </w:rPr>
+        <w:t xml:space="preserve"> This include </w:t>
+      </w:r>
+      <w:r>
+        <w:rPr>
+          <w:rFonts w:ascii="Calibri" w:hAnsi="Calibri"/>
+          <w:bCs/>
+          <w:sz w:val="22"/>
+          <w:szCs w:val="22"/>
+        </w:rPr>
+        <w:t>“</w:t>
+      </w:r>
+      <w:r>
+        <w:rPr>
+          <w:rFonts w:ascii="Calibri" w:hAnsi="Calibri"/>
+          <w:bCs/>
+          <w:sz w:val="22"/>
+          <w:szCs w:val="22"/>
+        </w:rPr>
+        <w:t>Table III.</w:t>
+      </w:r>
+      <w:r>
+        <w:rPr>
+          <w:rFonts w:ascii="Calibri" w:hAnsi="Calibri"/>
+          <w:bCs/>
+          <w:sz w:val="22"/>
+          <w:szCs w:val="22"/>
+        </w:rPr>
+        <w:t xml:space="preserve"> </w:t>
+      </w:r>
+      <w:r>
+        <w:rPr>
+          <w:rFonts w:ascii="Calibri" w:hAnsi="Calibri"/>
+          <w:bCs/>
+          <w:sz w:val="22"/>
+          <w:szCs w:val="22"/>
+        </w:rPr>
+        <w:t>COMPARISON BETWEEN OUR FIVE-UNIT-CELL DESIGNS AND OTHER OPTICAL DEVICES</w:t>
+      </w:r>
+      <w:r>
+        <w:rPr>
+          <w:rFonts w:ascii="Calibri" w:hAnsi="Calibri"/>
+          <w:bCs/>
+          <w:sz w:val="22"/>
+          <w:szCs w:val="22"/>
+        </w:rPr>
+        <w:t>” for comparison.</w:t>
       </w:r>
     </w:p>
     <w:p>
@@ -1175,6 +1519,14 @@
           <w:sz w:val="22"/>
           <w:szCs w:val="22"/>
         </w:rPr>
+        <w:t xml:space="preserve"> text describing the</w:t>
+      </w:r>
+      <w:r>
+        <w:rPr>
+          <w:rFonts w:ascii="Calibri" w:hAnsi="Calibri"/>
+          <w:sz w:val="22"/>
+          <w:szCs w:val="22"/>
+        </w:rPr>
         <w:t xml:space="preserve"> lack of experimental validation has been added in the </w:t>
       </w:r>
       <w:r>
@@ -1183,22 +1535,15 @@
           <w:sz w:val="22"/>
           <w:szCs w:val="22"/>
         </w:rPr>
-        <w:t xml:space="preserve">IV.D. </w:t>
-      </w:r>
-      <w:r>
-        <w:rPr>
-          <w:rFonts w:ascii="Calibri" w:hAnsi="Calibri"/>
-          <w:sz w:val="22"/>
-          <w:szCs w:val="22"/>
-        </w:rPr>
-        <w:t>Limitation and Future Works Suggestion section.</w:t>
-      </w:r>
-    </w:p>
-    <w:p>
-      <w:pPr>
-        <w:jc w:val="both"/>
-        <w:rPr>
-          <w:rFonts w:ascii="Calibri" w:hAnsi="Calibri"/>
+        <w:t>Limitations and Future Work Suggestions section.</w:t>
+      </w:r>
+    </w:p>
+    <w:p>
+      <w:pPr>
+        <w:jc w:val="both"/>
+        <w:rPr>
+          <w:rFonts w:ascii="Calibri" w:hAnsi="Calibri"/>
+          <w:bCs/>
           <w:sz w:val="22"/>
           <w:szCs w:val="22"/>
         </w:rPr>
@@ -1211,6 +1556,33 @@
           <w:szCs w:val="22"/>
         </w:rPr>
         <w:t>Author action:</w:t>
+      </w:r>
+      <w:r>
+        <w:rPr>
+          <w:rFonts w:ascii="Calibri" w:hAnsi="Calibri"/>
+          <w:b/>
+          <w:sz w:val="22"/>
+          <w:szCs w:val="22"/>
+        </w:rPr>
+        <w:t xml:space="preserve"> </w:t>
+      </w:r>
+      <w:r>
+        <w:rPr>
+          <w:rFonts w:ascii="Calibri" w:hAnsi="Calibri"/>
+          <w:bCs/>
+          <w:sz w:val="22"/>
+          <w:szCs w:val="22"/>
+        </w:rPr>
+        <w:t xml:space="preserve">We highlight this limitation in IV.E. </w:t>
+      </w:r>
+      <w:r>
+        <w:rPr>
+          <w:rFonts w:ascii="Calibri" w:hAnsi="Calibri"/>
+          <w:bCs/>
+          <w:sz w:val="22"/>
+          <w:szCs w:val="22"/>
+        </w:rPr>
+        <w:t>E. LIMITATIONS AND FUTURE WORK SUGGESTIONS</w:t>
       </w:r>
     </w:p>
     <w:p>
@@ -1268,22 +1640,12 @@
           <w:rFonts w:ascii="Calibri" w:hAnsi="Calibri"/>
           <w:b/>
           <w:bCs/>
-          <w:color w:val="008000"/>
-          <w:sz w:val="22"/>
-          <w:szCs w:val="22"/>
-        </w:rPr>
-        <w:t>Reviewer#1</w:t>
-      </w:r>
-      <w:r>
-        <w:rPr>
-          <w:rFonts w:ascii="Calibri" w:hAnsi="Calibri"/>
-          <w:b/>
-          <w:bCs/>
-          <w:color w:val="008000"/>
-          <w:sz w:val="22"/>
-          <w:szCs w:val="22"/>
-        </w:rPr>
-        <w:t>, Concern # 3</w:t>
+          <w:strike/>
+          <w:color w:val="008000"/>
+          <w:sz w:val="22"/>
+          <w:szCs w:val="22"/>
+        </w:rPr>
+        <w:t>Reviewer#1, Concern # 3</w:t>
       </w:r>
       <w:r>
         <w:rPr>
@@ -1658,6 +2020,7 @@
           <w:rFonts w:ascii="Calibri" w:hAnsi="Calibri"/>
           <w:b/>
           <w:bCs/>
+          <w:strike/>
           <w:color w:val="008000"/>
           <w:sz w:val="22"/>
           <w:szCs w:val="22"/>
@@ -1669,6 +2032,7 @@
           <w:rFonts w:ascii="Calibri" w:hAnsi="Calibri"/>
           <w:b/>
           <w:bCs/>
+          <w:strike/>
           <w:color w:val="008000"/>
           <w:sz w:val="22"/>
           <w:szCs w:val="22"/>
@@ -1680,6 +2044,7 @@
           <w:rFonts w:ascii="Calibri" w:hAnsi="Calibri"/>
           <w:b/>
           <w:bCs/>
+          <w:strike/>
           <w:color w:val="008000"/>
           <w:sz w:val="22"/>
           <w:szCs w:val="22"/>
@@ -1691,6 +2056,7 @@
           <w:rFonts w:ascii="Calibri" w:hAnsi="Calibri"/>
           <w:b/>
           <w:bCs/>
+          <w:strike/>
           <w:color w:val="008000"/>
           <w:sz w:val="22"/>
           <w:szCs w:val="22"/>
@@ -1786,14 +2152,24 @@
         </w:rPr>
         <w:t xml:space="preserve">  </w:t>
       </w:r>
-    </w:p>
-    <w:p>
-      <w:pPr>
-        <w:jc w:val="both"/>
-        <w:rPr>
-          <w:rFonts w:ascii="Calibri" w:hAnsi="Calibri"/>
-          <w:sz w:val="22"/>
-          <w:szCs w:val="22"/>
+      <w:r>
+        <w:rPr>
+          <w:rFonts w:ascii="Calibri" w:hAnsi="Calibri"/>
+          <w:sz w:val="22"/>
+          <w:szCs w:val="22"/>
+        </w:rPr>
+        <w:t>This is similar to Concern #1. The response is the same.</w:t>
+      </w:r>
+    </w:p>
+    <w:p>
+      <w:pPr>
+        <w:jc w:val="both"/>
+        <w:rPr>
+          <w:rFonts w:ascii="Calibri" w:hAnsi="Calibri" w:cstheme="minorBidi"/>
+          <w:bCs/>
+          <w:sz w:val="22"/>
+          <w:szCs w:val="28"/>
+          <w:lang w:bidi="th-TH"/>
         </w:rPr>
       </w:pPr>
       <w:r>
@@ -1817,18 +2193,38 @@
       <w:r>
         <w:rPr>
           <w:rFonts w:ascii="Calibri" w:hAnsi="Calibri"/>
-          <w:sz w:val="22"/>
-          <w:szCs w:val="22"/>
-        </w:rPr>
-        <w:t>We updated the manuscript by …</w:t>
-      </w:r>
-      <w:r>
-        <w:rPr>
-          <w:rFonts w:ascii="Calibri" w:hAnsi="Calibri"/>
-          <w:sz w:val="22"/>
-          <w:szCs w:val="22"/>
-        </w:rPr>
-        <w:t>.</w:t>
+          <w:bCs/>
+          <w:sz w:val="22"/>
+          <w:szCs w:val="22"/>
+        </w:rPr>
+        <w:t>W</w:t>
+      </w:r>
+      <w:r>
+        <w:rPr>
+          <w:rFonts w:ascii="Calibri" w:hAnsi="Calibri"/>
+          <w:bCs/>
+          <w:sz w:val="22"/>
+          <w:szCs w:val="22"/>
+        </w:rPr>
+        <w:t xml:space="preserve">e add section titled IV.D. COMPARISON WITH OTHER OPTICAL DEVICES </w:t>
+      </w:r>
+      <w:r>
+        <w:rPr>
+          <w:rFonts w:ascii="Calibri" w:hAnsi="Calibri"/>
+          <w:bCs/>
+          <w:sz w:val="22"/>
+          <w:szCs w:val="22"/>
+        </w:rPr>
+        <w:t xml:space="preserve">and </w:t>
+      </w:r>
+      <w:r>
+        <w:rPr>
+          <w:rFonts w:ascii="Calibri" w:hAnsi="Calibri"/>
+          <w:bCs/>
+          <w:sz w:val="22"/>
+          <w:szCs w:val="22"/>
+        </w:rPr>
+        <w:t>include comparison Table III.</w:t>
       </w:r>
     </w:p>
     <w:p>
@@ -1986,6 +2382,7 @@
           <w:sz w:val="22"/>
           <w:szCs w:val="22"/>
         </w:rPr>
+        <w:lastRenderedPageBreak/>
         <w:t>Author re</w:t>
       </w:r>
       <w:r>
@@ -2228,7 +2625,6 @@
           <w:sz w:val="22"/>
           <w:szCs w:val="22"/>
         </w:rPr>
-        <w:lastRenderedPageBreak/>
         <w:pict w14:anchorId="551D11CC">
           <v:shape id="_x0000_i1029" type="#_x0000_t75" alt="Default Line" style="width:481.55pt;height:1.55pt" o:hrpct="0" o:hralign="center" o:hr="t">
             <v:imagedata r:id="rId5" o:title="Default Line"/>
@@ -2790,28 +3186,19 @@
           <w:rFonts w:ascii="Calibri" w:hAnsi="Calibri"/>
           <w:b/>
           <w:bCs/>
-          <w:color w:val="008000"/>
-          <w:sz w:val="22"/>
-          <w:szCs w:val="22"/>
-        </w:rPr>
-        <w:t>Reviewer#</w:t>
-      </w:r>
-      <w:r>
-        <w:rPr>
-          <w:rFonts w:ascii="Calibri" w:hAnsi="Calibri"/>
-          <w:b/>
-          <w:bCs/>
-          <w:color w:val="008000"/>
-          <w:sz w:val="22"/>
-          <w:szCs w:val="22"/>
-        </w:rPr>
-        <w:t xml:space="preserve">1, Concern # </w:t>
-      </w:r>
-      <w:r>
-        <w:rPr>
-          <w:rFonts w:ascii="Calibri" w:hAnsi="Calibri"/>
-          <w:b/>
-          <w:bCs/>
+          <w:strike/>
+          <w:color w:val="008000"/>
+          <w:sz w:val="22"/>
+          <w:szCs w:val="22"/>
+        </w:rPr>
+        <w:t xml:space="preserve">Reviewer#1, Concern # </w:t>
+      </w:r>
+      <w:r>
+        <w:rPr>
+          <w:rFonts w:ascii="Calibri" w:hAnsi="Calibri"/>
+          <w:b/>
+          <w:bCs/>
+          <w:strike/>
           <w:color w:val="008000"/>
           <w:sz w:val="22"/>
           <w:szCs w:val="22"/>
@@ -2925,6 +3312,14 @@
           <w:szCs w:val="22"/>
         </w:rPr>
         <w:t>The discussions and analysis have already been provided in detail directly after each simulated result.</w:t>
+      </w:r>
+      <w:r>
+        <w:rPr>
+          <w:rFonts w:ascii="Calibri" w:hAnsi="Calibri"/>
+          <w:sz w:val="22"/>
+          <w:szCs w:val="22"/>
+        </w:rPr>
+        <w:t xml:space="preserve"> Since there is no specific concern, we didn’t take any action.</w:t>
       </w:r>
     </w:p>
     <w:p>
@@ -3224,7 +3619,23 @@
           <w:sz w:val="22"/>
           <w:szCs w:val="22"/>
         </w:rPr>
-        <w:t>We thank Reviewer#1 for your valuable suggestions.</w:t>
+        <w:t xml:space="preserve">We thank Reviewer#1 for </w:t>
+      </w:r>
+      <w:r>
+        <w:rPr>
+          <w:rFonts w:ascii="Calibri" w:hAnsi="Calibri"/>
+          <w:sz w:val="22"/>
+          <w:szCs w:val="22"/>
+        </w:rPr>
+        <w:t xml:space="preserve">a lot of </w:t>
+      </w:r>
+      <w:r>
+        <w:rPr>
+          <w:rFonts w:ascii="Calibri" w:hAnsi="Calibri"/>
+          <w:sz w:val="22"/>
+          <w:szCs w:val="22"/>
+        </w:rPr>
+        <w:t>suggestions.</w:t>
       </w:r>
     </w:p>
     <w:p>
@@ -3282,22 +3693,23 @@
           <w:rFonts w:ascii="Calibri" w:hAnsi="Calibri"/>
           <w:b/>
           <w:bCs/>
-          <w:color w:val="008000"/>
-          <w:sz w:val="22"/>
-          <w:szCs w:val="22"/>
-        </w:rPr>
-        <w:t>Reviewer#</w:t>
-      </w:r>
-      <w:r>
-        <w:rPr>
-          <w:rFonts w:ascii="Calibri" w:hAnsi="Calibri"/>
-          <w:b/>
-          <w:bCs/>
-          <w:color w:val="008000"/>
-          <w:sz w:val="22"/>
-          <w:szCs w:val="22"/>
-        </w:rPr>
-        <w:t>2, Concern # 1 (</w:t>
+          <w:strike/>
+          <w:color w:val="008000"/>
+          <w:sz w:val="22"/>
+          <w:szCs w:val="22"/>
+        </w:rPr>
+        <w:t>Reviewer#2, Concern # 1</w:t>
+      </w:r>
+      <w:r>
+        <w:rPr>
+          <w:rFonts w:ascii="Calibri" w:hAnsi="Calibri"/>
+          <w:b/>
+          <w:bCs/>
+          <w:color w:val="008000"/>
+          <w:sz w:val="22"/>
+          <w:szCs w:val="22"/>
+        </w:rPr>
+        <w:t xml:space="preserve"> (</w:t>
       </w:r>
       <w:r>
         <w:rPr>
@@ -3349,7 +3761,6 @@
           <w:sz w:val="22"/>
           <w:szCs w:val="22"/>
         </w:rPr>
-        <w:lastRenderedPageBreak/>
         <w:t>Author re</w:t>
       </w:r>
       <w:r>
@@ -3392,23 +3803,13 @@
           <w:sz w:val="22"/>
           <w:szCs w:val="22"/>
         </w:rPr>
-        <w:t>“</w:t>
-      </w:r>
-      <w:r>
-        <w:rPr>
-          <w:rFonts w:ascii="Calibri" w:hAnsi="Calibri"/>
-          <w:sz w:val="22"/>
-          <w:szCs w:val="22"/>
-          <w:highlight w:val="yellow"/>
-        </w:rPr>
-        <w:t xml:space="preserve">Constant-envelope waveform design” has no relation to any </w:t>
-      </w:r>
-      <w:r>
-        <w:rPr>
-          <w:rFonts w:ascii="Calibri" w:hAnsi="Calibri"/>
-          <w:sz w:val="22"/>
-          <w:szCs w:val="22"/>
-          <w:highlight w:val="yellow"/>
+        <w:t xml:space="preserve">“Constant-envelope waveform design” has no relation to any </w:t>
+      </w:r>
+      <w:r>
+        <w:rPr>
+          <w:rFonts w:ascii="Calibri" w:hAnsi="Calibri"/>
+          <w:sz w:val="22"/>
+          <w:szCs w:val="22"/>
         </w:rPr>
         <w:t>designs</w:t>
       </w:r>
@@ -3417,16 +3818,30 @@
           <w:rFonts w:ascii="Calibri" w:hAnsi="Calibri"/>
           <w:sz w:val="22"/>
           <w:szCs w:val="22"/>
-          <w:highlight w:val="yellow"/>
-        </w:rPr>
-        <w:t xml:space="preserve"> in </w:t>
-      </w:r>
-      <w:r>
-        <w:rPr>
-          <w:rFonts w:ascii="Calibri" w:hAnsi="Calibri"/>
-          <w:sz w:val="22"/>
-          <w:szCs w:val="22"/>
-          <w:highlight w:val="yellow"/>
+        </w:rPr>
+        <w:t xml:space="preserve"> </w:t>
+      </w:r>
+      <w:r>
+        <w:rPr>
+          <w:rFonts w:ascii="Calibri" w:hAnsi="Calibri"/>
+          <w:sz w:val="22"/>
+          <w:szCs w:val="22"/>
+        </w:rPr>
+        <w:t xml:space="preserve">shown </w:t>
+      </w:r>
+      <w:r>
+        <w:rPr>
+          <w:rFonts w:ascii="Calibri" w:hAnsi="Calibri"/>
+          <w:sz w:val="22"/>
+          <w:szCs w:val="22"/>
+        </w:rPr>
+        <w:t xml:space="preserve">in </w:t>
+      </w:r>
+      <w:r>
+        <w:rPr>
+          <w:rFonts w:ascii="Calibri" w:hAnsi="Calibri"/>
+          <w:sz w:val="22"/>
+          <w:szCs w:val="22"/>
         </w:rPr>
         <w:t>this</w:t>
       </w:r>
@@ -3435,151 +3850,122 @@
           <w:rFonts w:ascii="Calibri" w:hAnsi="Calibri"/>
           <w:sz w:val="22"/>
           <w:szCs w:val="22"/>
-          <w:highlight w:val="yellow"/>
-        </w:rPr>
-        <w:t xml:space="preserve"> work. However, we have </w:t>
-      </w:r>
-      <w:r>
-        <w:rPr>
-          <w:rFonts w:ascii="Calibri" w:hAnsi="Calibri"/>
-          <w:sz w:val="22"/>
-          <w:szCs w:val="22"/>
-          <w:highlight w:val="yellow"/>
-        </w:rPr>
-        <w:t>added</w:t>
-      </w:r>
-      <w:r>
-        <w:rPr>
-          <w:rFonts w:ascii="Calibri" w:hAnsi="Calibri"/>
-          <w:sz w:val="22"/>
-          <w:szCs w:val="22"/>
-          <w:highlight w:val="yellow"/>
-        </w:rPr>
-        <w:t xml:space="preserve"> the comparison between our design and </w:t>
-      </w:r>
-      <w:r>
-        <w:rPr>
-          <w:rFonts w:ascii="Calibri" w:hAnsi="Calibri"/>
-          <w:sz w:val="22"/>
-          <w:szCs w:val="22"/>
-        </w:rPr>
-        <w:t>previously published design (Sb</w:t>
-      </w:r>
-      <w:r>
-        <w:rPr>
-          <w:rFonts w:ascii="Calibri" w:hAnsi="Calibri"/>
-          <w:sz w:val="22"/>
-          <w:szCs w:val="22"/>
-          <w:vertAlign w:val="subscript"/>
-        </w:rPr>
-        <w:t>2</w:t>
-      </w:r>
-      <w:r>
-        <w:rPr>
-          <w:rFonts w:ascii="Calibri" w:hAnsi="Calibri"/>
-          <w:sz w:val="22"/>
-          <w:szCs w:val="22"/>
-        </w:rPr>
-        <w:t>Se</w:t>
-      </w:r>
-      <w:r>
-        <w:rPr>
-          <w:rFonts w:ascii="Calibri" w:hAnsi="Calibri"/>
-          <w:sz w:val="22"/>
-          <w:szCs w:val="22"/>
-          <w:vertAlign w:val="subscript"/>
-        </w:rPr>
-        <w:t>3</w:t>
-      </w:r>
-      <w:r>
-        <w:rPr>
-          <w:rFonts w:ascii="Calibri" w:hAnsi="Calibri"/>
-          <w:sz w:val="22"/>
-          <w:szCs w:val="22"/>
-        </w:rPr>
-        <w:t>-based and other PCM-based).</w:t>
-      </w:r>
-      <w:r>
-        <w:rPr>
-          <w:rFonts w:ascii="Calibri" w:hAnsi="Calibri"/>
+        </w:rPr>
+        <w:t xml:space="preserve"> work. </w:t>
+      </w:r>
+      <w:r>
+        <w:rPr>
+          <w:rFonts w:ascii="Calibri" w:hAnsi="Calibri"/>
+          <w:sz w:val="22"/>
+          <w:szCs w:val="22"/>
+        </w:rPr>
+        <w:t>However, we have added</w:t>
+      </w:r>
+      <w:r>
+        <w:rPr>
+          <w:rFonts w:ascii="Calibri" w:hAnsi="Calibri"/>
+          <w:sz w:val="22"/>
+          <w:szCs w:val="22"/>
+        </w:rPr>
+        <w:t xml:space="preserve"> comparison </w:t>
+      </w:r>
+      <w:r>
+        <w:rPr>
+          <w:rFonts w:ascii="Calibri" w:hAnsi="Calibri"/>
+          <w:sz w:val="22"/>
+          <w:szCs w:val="22"/>
+        </w:rPr>
+        <w:t>table to other optical devices</w:t>
+      </w:r>
+      <w:r>
+        <w:rPr>
+          <w:rFonts w:ascii="Calibri" w:hAnsi="Calibri"/>
+          <w:sz w:val="22"/>
+          <w:szCs w:val="22"/>
+        </w:rPr>
+        <w:t xml:space="preserve"> (Table. III).</w:t>
+      </w:r>
+    </w:p>
+    <w:p>
+      <w:pPr>
+        <w:jc w:val="both"/>
+        <w:rPr>
+          <w:rFonts w:ascii="Calibri" w:hAnsi="Calibri"/>
+          <w:sz w:val="22"/>
+          <w:szCs w:val="22"/>
+        </w:rPr>
+      </w:pPr>
+      <w:r>
+        <w:rPr>
+          <w:rFonts w:ascii="Calibri" w:hAnsi="Calibri"/>
+          <w:b/>
+          <w:sz w:val="22"/>
+          <w:szCs w:val="22"/>
+        </w:rPr>
+        <w:t>Author action:</w:t>
+      </w:r>
+      <w:r>
+        <w:rPr>
+          <w:rFonts w:ascii="Calibri" w:hAnsi="Calibri"/>
+          <w:bCs/>
+          <w:sz w:val="22"/>
+          <w:szCs w:val="22"/>
+        </w:rPr>
+        <w:t xml:space="preserve"> We didn’t </w:t>
+      </w:r>
+      <w:r>
+        <w:rPr>
+          <w:rFonts w:ascii="Calibri" w:hAnsi="Calibri"/>
+          <w:bCs/>
+          <w:sz w:val="22"/>
+          <w:szCs w:val="22"/>
+        </w:rPr>
+        <w:t>take</w:t>
+      </w:r>
+      <w:r>
+        <w:rPr>
+          <w:rFonts w:ascii="Calibri" w:hAnsi="Calibri"/>
+          <w:bCs/>
+          <w:sz w:val="22"/>
+          <w:szCs w:val="22"/>
+        </w:rPr>
+        <w:t xml:space="preserve"> any action </w:t>
+      </w:r>
+      <w:r>
+        <w:rPr>
+          <w:rFonts w:ascii="Calibri" w:hAnsi="Calibri"/>
+          <w:bCs/>
+          <w:sz w:val="22"/>
+          <w:szCs w:val="22"/>
+        </w:rPr>
+        <w:t>to t</w:t>
+      </w:r>
+      <w:r>
+        <w:rPr>
+          <w:rFonts w:ascii="Calibri" w:hAnsi="Calibri"/>
+          <w:bCs/>
+          <w:sz w:val="22"/>
+          <w:szCs w:val="22"/>
+        </w:rPr>
+        <w:t>his particular concern</w:t>
+      </w:r>
+      <w:r>
+        <w:rPr>
+          <w:rFonts w:ascii="Calibri" w:hAnsi="Calibri"/>
+          <w:bCs/>
+          <w:sz w:val="22"/>
+          <w:szCs w:val="22"/>
+        </w:rPr>
+        <w:t>.</w:t>
+      </w:r>
+      <w:r>
+        <w:rPr>
+          <w:rFonts w:ascii="Calibri" w:hAnsi="Calibri"/>
+          <w:bCs/>
           <w:sz w:val="22"/>
           <w:szCs w:val="22"/>
         </w:rPr>
         <w:t xml:space="preserve"> </w:t>
-      </w:r>
-    </w:p>
-    <w:p>
-      <w:pPr>
-        <w:jc w:val="both"/>
-        <w:rPr>
-          <w:rFonts w:ascii="Calibri" w:hAnsi="Calibri"/>
-          <w:bCs/>
-          <w:sz w:val="22"/>
-          <w:szCs w:val="22"/>
-        </w:rPr>
-      </w:pPr>
-      <w:r>
-        <w:rPr>
-          <w:rFonts w:ascii="Calibri" w:hAnsi="Calibri"/>
-          <w:b/>
-          <w:sz w:val="22"/>
-          <w:szCs w:val="22"/>
-        </w:rPr>
-        <w:t>Author action:</w:t>
-      </w:r>
-      <w:r>
-        <w:rPr>
-          <w:rFonts w:ascii="Calibri" w:hAnsi="Calibri"/>
-          <w:bCs/>
-          <w:sz w:val="22"/>
-          <w:szCs w:val="22"/>
-        </w:rPr>
-        <w:t xml:space="preserve"> We didn’t </w:t>
-      </w:r>
-      <w:r>
-        <w:rPr>
-          <w:rFonts w:ascii="Calibri" w:hAnsi="Calibri"/>
-          <w:bCs/>
-          <w:sz w:val="22"/>
-          <w:szCs w:val="22"/>
-        </w:rPr>
-        <w:t>take</w:t>
-      </w:r>
-      <w:r>
-        <w:rPr>
-          <w:rFonts w:ascii="Calibri" w:hAnsi="Calibri"/>
-          <w:bCs/>
-          <w:sz w:val="22"/>
-          <w:szCs w:val="22"/>
-        </w:rPr>
-        <w:t xml:space="preserve"> any action </w:t>
-      </w:r>
-      <w:r>
-        <w:rPr>
-          <w:rFonts w:ascii="Calibri" w:hAnsi="Calibri"/>
-          <w:bCs/>
-          <w:sz w:val="22"/>
-          <w:szCs w:val="22"/>
-        </w:rPr>
-        <w:t>to t</w:t>
-      </w:r>
-      <w:r>
-        <w:rPr>
-          <w:rFonts w:ascii="Calibri" w:hAnsi="Calibri"/>
-          <w:bCs/>
-          <w:sz w:val="22"/>
-          <w:szCs w:val="22"/>
-        </w:rPr>
-        <w:t>his particular concern</w:t>
-      </w:r>
-      <w:r>
-        <w:rPr>
-          <w:rFonts w:ascii="Calibri" w:hAnsi="Calibri"/>
-          <w:bCs/>
-          <w:sz w:val="22"/>
-          <w:szCs w:val="22"/>
-        </w:rPr>
-        <w:t>.</w:t>
       </w:r>
     </w:p>
     <w:p>
@@ -3927,14 +4313,6 @@
         </w:rPr>
         <w:t>:</w:t>
       </w:r>
-      <w:r>
-        <w:rPr>
-          <w:rFonts w:ascii="Calibri" w:hAnsi="Calibri"/>
-          <w:sz w:val="22"/>
-          <w:szCs w:val="22"/>
-        </w:rPr>
-        <w:t xml:space="preserve">  </w:t>
-      </w:r>
     </w:p>
     <w:p>
       <w:pPr>
@@ -4137,7 +4515,15 @@
           <w:szCs w:val="22"/>
           <w:highlight w:val="yellow"/>
         </w:rPr>
-        <w:t>Fig. 5</w:t>
+        <w:t xml:space="preserve">Fig. </w:t>
+      </w:r>
+      <w:r>
+        <w:rPr>
+          <w:rFonts w:ascii="Calibri" w:hAnsi="Calibri"/>
+          <w:sz w:val="22"/>
+          <w:szCs w:val="22"/>
+        </w:rPr>
+        <w:t>6</w:t>
       </w:r>
       <w:r>
         <w:rPr>
@@ -4291,6 +4677,7 @@
           <w:sz w:val="22"/>
           <w:szCs w:val="22"/>
         </w:rPr>
+        <w:lastRenderedPageBreak/>
         <w:t>Reviewer#</w:t>
       </w:r>
       <w:r>
@@ -4399,7 +4786,6 @@
           <w:sz w:val="22"/>
           <w:szCs w:val="22"/>
         </w:rPr>
-        <w:lastRenderedPageBreak/>
         <w:t>Author action:</w:t>
       </w:r>
       <w:r>
@@ -4500,22 +4886,23 @@
           <w:rFonts w:ascii="Calibri" w:hAnsi="Calibri"/>
           <w:b/>
           <w:bCs/>
-          <w:color w:val="008000"/>
-          <w:sz w:val="22"/>
-          <w:szCs w:val="22"/>
-        </w:rPr>
-        <w:t>Reviewer#</w:t>
-      </w:r>
-      <w:r>
-        <w:rPr>
-          <w:rFonts w:ascii="Calibri" w:hAnsi="Calibri"/>
-          <w:b/>
-          <w:bCs/>
-          <w:color w:val="008000"/>
-          <w:sz w:val="22"/>
-          <w:szCs w:val="22"/>
-        </w:rPr>
-        <w:t>2, Concern # 6 (</w:t>
+          <w:strike/>
+          <w:color w:val="008000"/>
+          <w:sz w:val="22"/>
+          <w:szCs w:val="22"/>
+        </w:rPr>
+        <w:t>Reviewer#2, Concern # 6</w:t>
+      </w:r>
+      <w:r>
+        <w:rPr>
+          <w:rFonts w:ascii="Calibri" w:hAnsi="Calibri"/>
+          <w:b/>
+          <w:bCs/>
+          <w:color w:val="008000"/>
+          <w:sz w:val="22"/>
+          <w:szCs w:val="22"/>
+        </w:rPr>
+        <w:t xml:space="preserve"> (</w:t>
       </w:r>
       <w:r>
         <w:rPr>
@@ -4611,7 +4998,25 @@
           <w:sz w:val="22"/>
           <w:szCs w:val="22"/>
         </w:rPr>
-        <w:t xml:space="preserve">All parameters setting for the optical simulations have already been provided in the III. Methods section (simulation spectral range and interval, refractive index dataset of each layer and substrate, substrate thickness, incident angle and polarization mode. The layer thickness is not specifically mentioned in nm but as QWOT where the reference wavelength has also been provided. We did this because the specific thickness of each layer </w:t>
+        <w:t xml:space="preserve">All parameters for the optical simulations have already been provided in the III. Methods section (simulation spectral range and interval, refractive index dataset of each layer and substrate, substrate thickness, incident angle and polarization mode. The layer thickness is not specifically mentioned in nm but </w:t>
+      </w:r>
+      <w:r>
+        <w:rPr>
+          <w:rFonts w:ascii="Calibri" w:hAnsi="Calibri"/>
+          <w:bCs/>
+          <w:sz w:val="22"/>
+          <w:szCs w:val="22"/>
+        </w:rPr>
+        <w:t xml:space="preserve">it is </w:t>
+      </w:r>
+      <w:r>
+        <w:rPr>
+          <w:rFonts w:ascii="Calibri" w:hAnsi="Calibri"/>
+          <w:bCs/>
+          <w:sz w:val="22"/>
+          <w:szCs w:val="22"/>
+        </w:rPr>
+        <w:t xml:space="preserve">QWOT where the reference wavelength has also been provided. We did this because the specific thickness of each layer </w:t>
       </w:r>
       <w:r>
         <w:rPr>
@@ -4647,180 +5052,214 @@
           <w:sz w:val="22"/>
           <w:szCs w:val="22"/>
         </w:rPr>
+        <w:t xml:space="preserve"> from one dataset to the other. We add each design layout to help with reproducibility.</w:t>
+      </w:r>
+      <w:r>
+        <w:rPr>
+          <w:rFonts w:ascii="Calibri" w:hAnsi="Calibri"/>
+          <w:bCs/>
+          <w:sz w:val="22"/>
+          <w:szCs w:val="22"/>
+        </w:rPr>
+        <w:t xml:space="preserve"> </w:t>
+      </w:r>
+    </w:p>
+    <w:p>
+      <w:pPr>
+        <w:pStyle w:val="1stcolumntext"/>
+        <w:rPr>
+          <w:rFonts w:ascii="Calibri" w:hAnsi="Calibri"/>
+          <w:bCs/>
+          <w:sz w:val="22"/>
+          <w:szCs w:val="22"/>
+        </w:rPr>
+      </w:pPr>
+      <w:r>
+        <w:rPr>
+          <w:rFonts w:ascii="Calibri" w:hAnsi="Calibri"/>
+          <w:bCs/>
+          <w:sz w:val="22"/>
+          <w:szCs w:val="22"/>
+        </w:rPr>
+        <w:tab/>
+      </w:r>
+      <w:r>
+        <w:rPr>
+          <w:rFonts w:ascii="Calibri" w:hAnsi="Calibri"/>
+          <w:bCs/>
+          <w:sz w:val="22"/>
+          <w:szCs w:val="22"/>
+        </w:rPr>
+        <w:t xml:space="preserve">The initialization and convergence criteria </w:t>
+      </w:r>
+      <w:r>
+        <w:rPr>
+          <w:rFonts w:ascii="Calibri" w:hAnsi="Calibri"/>
+          <w:bCs/>
+          <w:sz w:val="22"/>
+          <w:szCs w:val="22"/>
+        </w:rPr>
+        <w:t>for</w:t>
+      </w:r>
+      <w:r>
+        <w:rPr>
+          <w:rFonts w:ascii="Calibri" w:hAnsi="Calibri"/>
+          <w:bCs/>
+          <w:sz w:val="22"/>
+          <w:szCs w:val="22"/>
+        </w:rPr>
+        <w:t xml:space="preserve"> </w:t>
+      </w:r>
+      <w:r>
+        <w:rPr>
+          <w:rFonts w:ascii="Calibri" w:hAnsi="Calibri"/>
+          <w:bCs/>
+          <w:sz w:val="22"/>
+          <w:szCs w:val="22"/>
+        </w:rPr>
+        <w:t>optimization</w:t>
+      </w:r>
+      <w:r>
+        <w:rPr>
+          <w:rFonts w:ascii="Calibri" w:hAnsi="Calibri"/>
+          <w:bCs/>
+          <w:sz w:val="22"/>
+          <w:szCs w:val="22"/>
+        </w:rPr>
+        <w:t xml:space="preserve"> were also already provided in the IV.C.</w:t>
+      </w:r>
+      <w:r>
+        <w:rPr>
+          <w:rFonts w:ascii="Calibri" w:hAnsi="Calibri"/>
+          <w:bCs/>
+          <w:sz w:val="22"/>
+          <w:szCs w:val="22"/>
+        </w:rPr>
+        <w:t xml:space="preserve"> Transmittance tunability and optimization.</w:t>
+      </w:r>
+      <w:r>
+        <w:rPr>
+          <w:rFonts w:ascii="Calibri" w:hAnsi="Calibri"/>
+          <w:bCs/>
+          <w:sz w:val="22"/>
+          <w:szCs w:val="22"/>
+        </w:rPr>
+        <w:t xml:space="preserve"> T</w:t>
+      </w:r>
+      <w:r>
+        <w:rPr>
+          <w:rFonts w:ascii="Calibri" w:hAnsi="Calibri"/>
+          <w:bCs/>
+          <w:sz w:val="22"/>
+          <w:szCs w:val="22"/>
+        </w:rPr>
+        <w:t xml:space="preserve">he simulation code is uploaded to private </w:t>
+      </w:r>
+      <w:r>
+        <w:rPr>
+          <w:rFonts w:ascii="Calibri" w:hAnsi="Calibri"/>
+          <w:bCs/>
+          <w:sz w:val="22"/>
+          <w:szCs w:val="22"/>
+        </w:rPr>
+        <w:t>GitHub and</w:t>
+      </w:r>
+      <w:r>
+        <w:rPr>
+          <w:rFonts w:ascii="Calibri" w:hAnsi="Calibri"/>
+          <w:bCs/>
+          <w:sz w:val="22"/>
+          <w:szCs w:val="22"/>
+        </w:rPr>
+        <w:t xml:space="preserve"> will be shared upon a reasonable request.</w:t>
+      </w:r>
+    </w:p>
+    <w:p>
+      <w:pPr>
+        <w:pStyle w:val="1stcolumntext"/>
+        <w:rPr>
+          <w:rFonts w:ascii="Calibri" w:hAnsi="Calibri"/>
+          <w:bCs/>
+          <w:sz w:val="22"/>
+          <w:szCs w:val="22"/>
+        </w:rPr>
+      </w:pPr>
+    </w:p>
+    <w:p>
+      <w:pPr>
+        <w:pStyle w:val="1stcolumntext"/>
+        <w:rPr>
+          <w:rFonts w:ascii="Calibri" w:hAnsi="Calibri"/>
+          <w:bCs/>
+          <w:sz w:val="22"/>
+          <w:szCs w:val="22"/>
+        </w:rPr>
+      </w:pPr>
+      <w:r>
+        <w:rPr>
+          <w:rFonts w:ascii="Calibri" w:hAnsi="Calibri"/>
+          <w:b/>
+          <w:sz w:val="22"/>
+          <w:szCs w:val="22"/>
+        </w:rPr>
+        <w:t>Author action:</w:t>
+      </w:r>
+      <w:r>
+        <w:rPr>
+          <w:rFonts w:ascii="Calibri" w:hAnsi="Calibri"/>
+          <w:b/>
+          <w:sz w:val="22"/>
+          <w:szCs w:val="22"/>
+        </w:rPr>
+        <w:t xml:space="preserve"> </w:t>
+      </w:r>
+      <w:r>
+        <w:rPr>
+          <w:rFonts w:ascii="Calibri" w:hAnsi="Calibri"/>
+          <w:bCs/>
+          <w:sz w:val="22"/>
+          <w:szCs w:val="22"/>
+        </w:rPr>
+        <w:t xml:space="preserve">A layout of two–-layer, three-layer, and edge-filter design has been </w:t>
+      </w:r>
+      <w:r>
+        <w:rPr>
+          <w:rFonts w:ascii="Calibri" w:hAnsi="Calibri"/>
+          <w:bCs/>
+          <w:sz w:val="22"/>
+          <w:szCs w:val="22"/>
+        </w:rPr>
+        <w:t>added</w:t>
+      </w:r>
+      <w:r>
+        <w:rPr>
+          <w:rFonts w:ascii="Calibri" w:hAnsi="Calibri"/>
+          <w:bCs/>
+          <w:sz w:val="22"/>
+          <w:szCs w:val="22"/>
+        </w:rPr>
+        <w:t xml:space="preserve"> to their respective figures in section II.</w:t>
+      </w:r>
+    </w:p>
+    <w:p>
+      <w:pPr>
+        <w:pStyle w:val="1stcolumntext"/>
+      </w:pPr>
+      <w:r>
+        <w:rPr>
+          <w:rFonts w:asciiTheme="minorHAnsi" w:hAnsiTheme="minorHAnsi" w:cstheme="minorHAnsi"/>
+          <w:sz w:val="22"/>
+          <w:szCs w:val="22"/>
+        </w:rPr>
+        <w:t>We updated the manuscript by updating the Data Availability section to mention the simulation codes “Data and simulation codes underlying the results presented in this paper may be obtained from the corresponding author upon a reasonable request.”</w:t>
+      </w:r>
+      <w:r>
+        <w:rPr>
+          <w:rFonts w:asciiTheme="minorHAnsi" w:hAnsiTheme="minorHAnsi" w:cstheme="minorHAnsi"/>
+          <w:sz w:val="22"/>
+          <w:szCs w:val="22"/>
+        </w:rPr>
         <w:t xml:space="preserve">. </w:t>
-      </w:r>
-    </w:p>
-    <w:p>
-      <w:pPr>
-        <w:pStyle w:val="1stcolumntext"/>
-        <w:rPr>
-          <w:rFonts w:ascii="Calibri" w:hAnsi="Calibri"/>
-          <w:bCs/>
-          <w:sz w:val="22"/>
-          <w:szCs w:val="22"/>
-        </w:rPr>
-      </w:pPr>
-      <w:r>
-        <w:rPr>
-          <w:rFonts w:ascii="Calibri" w:hAnsi="Calibri"/>
-          <w:bCs/>
-          <w:sz w:val="22"/>
-          <w:szCs w:val="22"/>
-        </w:rPr>
-        <w:tab/>
-      </w:r>
-      <w:r>
-        <w:rPr>
-          <w:rFonts w:ascii="Calibri" w:hAnsi="Calibri"/>
-          <w:bCs/>
-          <w:sz w:val="22"/>
-          <w:szCs w:val="22"/>
-        </w:rPr>
-        <w:t xml:space="preserve">The initialization and convergence criteria </w:t>
-      </w:r>
-      <w:r>
-        <w:rPr>
-          <w:rFonts w:ascii="Calibri" w:hAnsi="Calibri"/>
-          <w:bCs/>
-          <w:sz w:val="22"/>
-          <w:szCs w:val="22"/>
-        </w:rPr>
-        <w:t>for</w:t>
-      </w:r>
-      <w:r>
-        <w:rPr>
-          <w:rFonts w:ascii="Calibri" w:hAnsi="Calibri"/>
-          <w:bCs/>
-          <w:sz w:val="22"/>
-          <w:szCs w:val="22"/>
-        </w:rPr>
-        <w:t xml:space="preserve"> </w:t>
-      </w:r>
-      <w:r>
-        <w:rPr>
-          <w:rFonts w:ascii="Calibri" w:hAnsi="Calibri"/>
-          <w:bCs/>
-          <w:sz w:val="22"/>
-          <w:szCs w:val="22"/>
-        </w:rPr>
-        <w:t>optimization</w:t>
-      </w:r>
-      <w:r>
-        <w:rPr>
-          <w:rFonts w:ascii="Calibri" w:hAnsi="Calibri"/>
-          <w:bCs/>
-          <w:sz w:val="22"/>
-          <w:szCs w:val="22"/>
-        </w:rPr>
-        <w:t xml:space="preserve"> were also already provided in the IV.C.</w:t>
-      </w:r>
-      <w:r>
-        <w:rPr>
-          <w:rFonts w:ascii="Calibri" w:hAnsi="Calibri"/>
-          <w:bCs/>
-          <w:sz w:val="22"/>
-          <w:szCs w:val="22"/>
-        </w:rPr>
-        <w:t xml:space="preserve"> Transmittance tunability and optimization.</w:t>
-      </w:r>
-    </w:p>
-    <w:p>
-      <w:pPr>
-        <w:pStyle w:val="1stcolumntext"/>
-        <w:rPr>
-          <w:rFonts w:ascii="Calibri" w:hAnsi="Calibri"/>
-          <w:bCs/>
-          <w:sz w:val="22"/>
-          <w:szCs w:val="22"/>
-        </w:rPr>
-      </w:pPr>
-      <w:r>
-        <w:rPr>
-          <w:rFonts w:ascii="Calibri" w:hAnsi="Calibri"/>
-          <w:bCs/>
-          <w:sz w:val="22"/>
-          <w:szCs w:val="22"/>
-        </w:rPr>
-        <w:tab/>
-      </w:r>
-      <w:r>
-        <w:rPr>
-          <w:rFonts w:ascii="Calibri" w:hAnsi="Calibri"/>
-          <w:bCs/>
-          <w:sz w:val="22"/>
-          <w:szCs w:val="22"/>
-        </w:rPr>
-        <w:t xml:space="preserve">The simulation code is uploaded to private </w:t>
-      </w:r>
-      <w:r>
-        <w:rPr>
-          <w:rFonts w:ascii="Calibri" w:hAnsi="Calibri"/>
-          <w:bCs/>
-          <w:sz w:val="22"/>
-          <w:szCs w:val="22"/>
-        </w:rPr>
-        <w:t>GitHub and</w:t>
-      </w:r>
-      <w:r>
-        <w:rPr>
-          <w:rFonts w:ascii="Calibri" w:hAnsi="Calibri"/>
-          <w:bCs/>
-          <w:sz w:val="22"/>
-          <w:szCs w:val="22"/>
-        </w:rPr>
-        <w:t xml:space="preserve"> will be shared upon a reasonable request.</w:t>
-      </w:r>
-    </w:p>
-    <w:p>
-      <w:pPr>
-        <w:jc w:val="both"/>
-        <w:rPr>
-          <w:rFonts w:ascii="Calibri" w:hAnsi="Calibri"/>
-          <w:sz w:val="22"/>
-          <w:szCs w:val="22"/>
-        </w:rPr>
-      </w:pPr>
-    </w:p>
-    <w:p>
-      <w:pPr>
-        <w:pStyle w:val="1stcolumntext"/>
-        <w:rPr>
-          <w:rFonts w:ascii="Calibri" w:hAnsi="Calibri"/>
-          <w:bCs/>
-          <w:sz w:val="22"/>
-          <w:szCs w:val="22"/>
-        </w:rPr>
-      </w:pPr>
-      <w:r>
-        <w:rPr>
-          <w:rFonts w:ascii="Calibri" w:hAnsi="Calibri"/>
-          <w:b/>
-          <w:sz w:val="22"/>
-          <w:szCs w:val="22"/>
-        </w:rPr>
-        <w:t>Author action:</w:t>
-      </w:r>
-      <w:r>
-        <w:rPr>
-          <w:rFonts w:ascii="Calibri" w:hAnsi="Calibri"/>
-          <w:b/>
-          <w:sz w:val="22"/>
-          <w:szCs w:val="22"/>
-        </w:rPr>
-        <w:t xml:space="preserve"> </w:t>
-      </w:r>
-    </w:p>
-    <w:p>
-      <w:pPr>
-        <w:pStyle w:val="1stcolumntext"/>
-      </w:pPr>
-      <w:r>
-        <w:rPr>
-          <w:rFonts w:asciiTheme="minorHAnsi" w:hAnsiTheme="minorHAnsi" w:cstheme="minorHAnsi"/>
-          <w:sz w:val="22"/>
-          <w:szCs w:val="22"/>
-        </w:rPr>
-        <w:t>We updated the manuscript by updating the Data Availability section to mention the simulation codes “Data and simulation codes underlying the results presented in this paper may be obtained from the corresponding author upon a reasonable request.”</w:t>
       </w:r>
     </w:p>
     <w:p>
@@ -4844,7 +5283,7 @@
           <w:szCs w:val="22"/>
         </w:rPr>
         <w:pict w14:anchorId="7A35FC08">
-          <v:shape id="_x0000_i1039" type="#_x0000_t75" alt="Default Line" style="width:481.55pt;height:1.55pt" o:hrpct="0" o:hralign="center" o:hr="t">
+          <v:shape id="_x0000_i1062" type="#_x0000_t75" alt="Default Line" style="width:481.55pt;height:1.55pt" o:hrpct="0" o:hralign="center" o:hr="t">
             <v:imagedata r:id="rId5" o:title="Default Line"/>
           </v:shape>
         </w:pict>
@@ -4878,22 +5317,23 @@
           <w:rFonts w:ascii="Calibri" w:hAnsi="Calibri"/>
           <w:b/>
           <w:bCs/>
-          <w:color w:val="008000"/>
-          <w:sz w:val="22"/>
-          <w:szCs w:val="22"/>
-        </w:rPr>
-        <w:t>Reviewer#</w:t>
-      </w:r>
-      <w:r>
-        <w:rPr>
-          <w:rFonts w:ascii="Calibri" w:hAnsi="Calibri"/>
-          <w:b/>
-          <w:bCs/>
-          <w:color w:val="008000"/>
-          <w:sz w:val="22"/>
-          <w:szCs w:val="22"/>
-        </w:rPr>
-        <w:t>2, Concern # 7 (</w:t>
+          <w:strike/>
+          <w:color w:val="008000"/>
+          <w:sz w:val="22"/>
+          <w:szCs w:val="22"/>
+        </w:rPr>
+        <w:t>Reviewer#2, Concern # 7</w:t>
+      </w:r>
+      <w:r>
+        <w:rPr>
+          <w:rFonts w:ascii="Calibri" w:hAnsi="Calibri"/>
+          <w:b/>
+          <w:bCs/>
+          <w:color w:val="008000"/>
+          <w:sz w:val="22"/>
+          <w:szCs w:val="22"/>
+        </w:rPr>
+        <w:t xml:space="preserve"> (</w:t>
       </w:r>
       <w:r>
         <w:rPr>
@@ -5119,15 +5559,15 @@
           <w:sz w:val="22"/>
           <w:szCs w:val="22"/>
         </w:rPr>
-        <w:t xml:space="preserve"> The FWHM </w:t>
-      </w:r>
-      <w:r>
-        <w:rPr>
-          <w:rFonts w:ascii="Calibri" w:hAnsi="Calibri"/>
-          <w:sz w:val="22"/>
-          <w:szCs w:val="22"/>
-        </w:rPr>
-        <w:t>of</w:t>
+        <w:t xml:space="preserve"> I</w:t>
+      </w:r>
+      <w:r>
+        <w:rPr>
+          <w:rFonts w:ascii="Calibri" w:hAnsi="Calibri"/>
+          <w:sz w:val="22"/>
+          <w:szCs w:val="22"/>
+        </w:rPr>
+        <w:t>n the III.A. SIMULATION OF OPTICAL PERFORMANCES section</w:t>
       </w:r>
       <w:r>
         <w:rPr>
@@ -5136,6 +5576,14 @@
           <w:szCs w:val="22"/>
         </w:rPr>
         <w:t xml:space="preserve"> </w:t>
+      </w:r>
+      <w:r>
+        <w:rPr>
+          <w:rFonts w:ascii="Calibri" w:hAnsi="Calibri"/>
+          <w:sz w:val="22"/>
+          <w:szCs w:val="22"/>
+        </w:rPr>
+        <w:t>“the high-contrast (</w:t>
       </w:r>
       <w:r>
         <w:rPr>
@@ -5153,7 +5601,7 @@
           <w:sz w:val="22"/>
           <w:szCs w:val="22"/>
         </w:rPr>
-        <w:t xml:space="preserve"> spectrum</w:t>
+        <w:t xml:space="preserve">) region spectral width” </w:t>
       </w:r>
       <w:r>
         <w:rPr>
@@ -5169,49 +5617,7 @@
           <w:sz w:val="22"/>
           <w:szCs w:val="22"/>
         </w:rPr>
-        <w:t>“the high-contrast (</w:t>
-      </w:r>
-      <w:r>
-        <w:rPr>
-          <w:rFonts w:ascii="Calibri" w:hAnsi="Calibri"/>
-          <w:i/>
-          <w:iCs/>
-          <w:sz w:val="22"/>
-          <w:szCs w:val="22"/>
-        </w:rPr>
-        <w:t>ΔT</w:t>
-      </w:r>
-      <w:r>
-        <w:rPr>
-          <w:rFonts w:ascii="Calibri" w:hAnsi="Calibri"/>
-          <w:sz w:val="22"/>
-          <w:szCs w:val="22"/>
-        </w:rPr>
-        <w:t xml:space="preserve">) region spectral width” </w:t>
-      </w:r>
-      <w:r>
-        <w:rPr>
-          <w:rFonts w:ascii="Calibri" w:hAnsi="Calibri"/>
-          <w:sz w:val="22"/>
-          <w:szCs w:val="22"/>
-        </w:rPr>
-        <w:t xml:space="preserve"> </w:t>
-      </w:r>
-      <w:r>
-        <w:rPr>
-          <w:rFonts w:ascii="Calibri" w:hAnsi="Calibri"/>
-          <w:sz w:val="22"/>
-          <w:szCs w:val="22"/>
-        </w:rPr>
-        <w:t>in the III.A. SIMULATION OF OPTICAL PERFORMANCES section</w:t>
-      </w:r>
-      <w:r>
-        <w:rPr>
-          <w:rFonts w:ascii="Calibri" w:hAnsi="Calibri"/>
-          <w:sz w:val="22"/>
-          <w:szCs w:val="22"/>
-        </w:rPr>
-        <w:t xml:space="preserve"> have </w:t>
+        <w:t xml:space="preserve">have </w:t>
       </w:r>
       <w:r>
         <w:rPr>
@@ -5262,7 +5668,23 @@
           <w:szCs w:val="22"/>
         </w:rPr>
         <w:br/>
-        <w:t>Thank you Reviewer #2 for the comments.</w:t>
+        <w:t xml:space="preserve">Thank you Reviewer #2 for </w:t>
+      </w:r>
+      <w:r>
+        <w:rPr>
+          <w:rFonts w:ascii="Calibri" w:hAnsi="Calibri"/>
+          <w:sz w:val="22"/>
+          <w:szCs w:val="22"/>
+        </w:rPr>
+        <w:t>the</w:t>
+      </w:r>
+      <w:r>
+        <w:rPr>
+          <w:rFonts w:ascii="Calibri" w:hAnsi="Calibri"/>
+          <w:sz w:val="22"/>
+          <w:szCs w:val="22"/>
+        </w:rPr>
+        <w:t xml:space="preserve"> comments.</w:t>
       </w:r>
     </w:p>
     <w:p>
@@ -5399,6 +5821,7 @@
           <w:sz w:val="22"/>
           <w:szCs w:val="22"/>
         </w:rPr>
+        <w:lastRenderedPageBreak/>
         <w:t>Author re</w:t>
       </w:r>
       <w:r>
@@ -5602,7 +6025,6 @@
           <w:sz w:val="22"/>
           <w:szCs w:val="22"/>
         </w:rPr>
-        <w:lastRenderedPageBreak/>
         <w:t>Author action:</w:t>
       </w:r>
       <w:r>
@@ -5670,22 +6092,23 @@
           <w:rFonts w:ascii="Calibri" w:hAnsi="Calibri"/>
           <w:b/>
           <w:bCs/>
-          <w:color w:val="008000"/>
-          <w:sz w:val="22"/>
-          <w:szCs w:val="22"/>
-        </w:rPr>
-        <w:t>Reviewer#</w:t>
-      </w:r>
-      <w:r>
-        <w:rPr>
-          <w:rFonts w:ascii="Calibri" w:hAnsi="Calibri"/>
-          <w:b/>
-          <w:bCs/>
-          <w:color w:val="008000"/>
-          <w:sz w:val="22"/>
-          <w:szCs w:val="22"/>
-        </w:rPr>
-        <w:t>3, Concern # 2 (</w:t>
+          <w:strike/>
+          <w:color w:val="008000"/>
+          <w:sz w:val="22"/>
+          <w:szCs w:val="22"/>
+        </w:rPr>
+        <w:t>Reviewer#3, Concern # 2</w:t>
+      </w:r>
+      <w:r>
+        <w:rPr>
+          <w:rFonts w:ascii="Calibri" w:hAnsi="Calibri"/>
+          <w:b/>
+          <w:bCs/>
+          <w:color w:val="008000"/>
+          <w:sz w:val="22"/>
+          <w:szCs w:val="22"/>
+        </w:rPr>
+        <w:t xml:space="preserve"> (</w:t>
       </w:r>
       <w:r>
         <w:rPr>
@@ -5767,33 +6190,506 @@
       </w:r>
       <w:r>
         <w:rPr>
-          <w:rFonts w:ascii="Calibri" w:hAnsi="Calibri"/>
-          <w:sz w:val="22"/>
-          <w:szCs w:val="22"/>
-        </w:rPr>
-        <w:t xml:space="preserve">We add the benchmark table to </w:t>
-      </w:r>
-      <w:r>
-        <w:rPr>
-          <w:rFonts w:ascii="Calibri" w:hAnsi="Calibri"/>
-          <w:sz w:val="22"/>
-          <w:szCs w:val="22"/>
-        </w:rPr>
-        <w:t>IV.</w:t>
-      </w:r>
-      <w:r>
-        <w:rPr>
-          <w:rFonts w:ascii="Calibri" w:hAnsi="Calibri"/>
-          <w:sz w:val="22"/>
-          <w:szCs w:val="22"/>
-        </w:rPr>
-        <w:t>D. Comparison to Other PCM-based Optical Filters</w:t>
-      </w:r>
-      <w:r>
-        <w:rPr>
-          <w:rFonts w:ascii="Calibri" w:hAnsi="Calibri"/>
-          <w:sz w:val="22"/>
-          <w:szCs w:val="22"/>
+          <w:rFonts w:asciiTheme="minorHAnsi" w:hAnsiTheme="minorHAnsi" w:cstheme="minorHAnsi"/>
+          <w:sz w:val="22"/>
+          <w:szCs w:val="22"/>
+        </w:rPr>
+        <w:t xml:space="preserve">Similar to Reviewer#1 Concern #4. We add a section titled “IV.D. COMPARISON WITH OTHER OPTICAL FILTERS”. In short, the reference are: </w:t>
+      </w:r>
+      <w:r>
+        <w:rPr>
+          <w:rFonts w:asciiTheme="minorHAnsi" w:hAnsiTheme="minorHAnsi" w:cstheme="minorHAnsi"/>
+          <w:sz w:val="22"/>
+          <w:szCs w:val="22"/>
+        </w:rPr>
+        <w:t>FP-cavities Sb</w:t>
+      </w:r>
+      <w:r>
+        <w:rPr>
+          <w:rFonts w:asciiTheme="minorHAnsi" w:hAnsiTheme="minorHAnsi" w:cstheme="minorHAnsi"/>
+          <w:sz w:val="22"/>
+          <w:szCs w:val="22"/>
+          <w:vertAlign w:val="subscript"/>
+        </w:rPr>
+        <w:t>2</w:t>
+      </w:r>
+      <w:r>
+        <w:rPr>
+          <w:rFonts w:asciiTheme="minorHAnsi" w:hAnsiTheme="minorHAnsi" w:cstheme="minorHAnsi"/>
+          <w:sz w:val="22"/>
+          <w:szCs w:val="22"/>
+        </w:rPr>
+        <w:t>Se</w:t>
+      </w:r>
+      <w:r>
+        <w:rPr>
+          <w:rFonts w:asciiTheme="minorHAnsi" w:hAnsiTheme="minorHAnsi" w:cstheme="minorHAnsi"/>
+          <w:sz w:val="22"/>
+          <w:szCs w:val="22"/>
+          <w:vertAlign w:val="subscript"/>
+        </w:rPr>
+        <w:t>3</w:t>
+      </w:r>
+      <w:r>
+        <w:rPr>
+          <w:rFonts w:asciiTheme="minorHAnsi" w:hAnsiTheme="minorHAnsi" w:cstheme="minorHAnsi"/>
+          <w:sz w:val="22"/>
+          <w:szCs w:val="22"/>
+        </w:rPr>
+        <w:t xml:space="preserve">-based filters (single/multichannel) at around the same operating wavelength </w:t>
+      </w:r>
+      <w:r>
+        <w:rPr>
+          <w:rFonts w:asciiTheme="minorHAnsi" w:hAnsiTheme="minorHAnsi" w:cstheme="minorHAnsi"/>
+          <w:sz w:val="22"/>
+          <w:szCs w:val="22"/>
+          <w:highlight w:val="yellow"/>
+          <w:lang w:bidi="th-TH"/>
+        </w:rPr>
+        <w:fldChar w:fldCharType="begin"/>
+      </w:r>
+      <w:r>
+        <w:rPr>
+          <w:rFonts w:asciiTheme="minorHAnsi" w:hAnsiTheme="minorHAnsi" w:cstheme="minorHAnsi"/>
+          <w:sz w:val="22"/>
+          <w:szCs w:val="22"/>
+          <w:highlight w:val="yellow"/>
+          <w:lang w:bidi="th-TH"/>
+        </w:rPr>
+        <w:instrText xml:space="preserve"> ADDIN EN.CITE &lt;EndNote&gt;&lt;Cite&gt;&lt;Author&gt;Cui&lt;/Author&gt;&lt;Year&gt;2026&lt;/Year&gt;&lt;RecNum&gt;112&lt;/RecNum&gt;&lt;DisplayText&gt;[1]&lt;/DisplayText&gt;&lt;record&gt;&lt;rec-number&gt;112&lt;/rec-number&gt;&lt;foreign-keys&gt;&lt;key app="EN" db-id="v920pft06rp9dbex2ap500x99x5rrtswxzss" timestamp="1781769544" guid="651a136b-596b-4777-b1c3-b64c8358dbd1"&gt;112&lt;/key&gt;&lt;/foreign-keys&gt;&lt;ref-type name="Journal Article"&gt;17&lt;/ref-type&gt;&lt;contributors&gt;&lt;authors&gt;&lt;author&gt;Cui, Mengxi&lt;/author&gt;&lt;author&gt;Xie, Yuxin&lt;/author&gt;&lt;author&gt;Yang, Pei&lt;/author&gt;&lt;author&gt;Wang, Junya&lt;/author&gt;&lt;author&gt;Li, Yi&lt;/author&gt;&lt;author&gt;He, Qiang&lt;/author&gt;&lt;author&gt;Miao, Xiangshui&lt;/author&gt;&lt;/authors&gt;&lt;/contributors&gt;&lt;titles&gt;&lt;title&gt;Tunable multi-channel optical filter based on the near-infrared ultralow-loss phase change material Sb2Se3&lt;/title&gt;&lt;secondary-title&gt;Optics Express&lt;/secondary-title&gt;&lt;alt-title&gt;Opt. Express&lt;/alt-title&gt;&lt;/titles&gt;&lt;periodical&gt;&lt;full-title&gt;Optics Express&lt;/full-title&gt;&lt;abbr-1&gt;Opt. Express&lt;/abbr-1&gt;&lt;/periodical&gt;&lt;alt-periodical&gt;&lt;full-title&gt;Optics Express&lt;/full-title&gt;&lt;abbr-1&gt;Opt. Express&lt;/abbr-1&gt;&lt;/alt-periodical&gt;&lt;pages&gt;7378-7387&lt;/pages&gt;&lt;volume&gt;34&lt;/volume&gt;&lt;number&gt;5&lt;/number&gt;&lt;keywords&gt;&lt;keyword&gt;Laser beam combining&lt;/keyword&gt;&lt;keyword&gt;Optical constants&lt;/keyword&gt;&lt;keyword&gt;Optical filters&lt;/keyword&gt;&lt;keyword&gt;Optical properties&lt;/keyword&gt;&lt;keyword&gt;Structural color&lt;/keyword&gt;&lt;keyword&gt;Thin films&lt;/keyword&gt;&lt;/keywords&gt;&lt;dates&gt;&lt;year&gt;2026&lt;/year&gt;&lt;pub-dates&gt;&lt;date&gt;2026/03/09&lt;/date&gt;&lt;/pub-dates&gt;&lt;/dates&gt;&lt;publisher&gt;Optica Publishing Group&lt;/publisher&gt;&lt;urls&gt;&lt;related-urls&gt;&lt;url&gt;https://opg.optica.org/oe/abstract.cfm?URI=oe-34-5-7378&lt;/url&gt;&lt;/related-urls&gt;&lt;/urls&gt;&lt;electronic-resource-num&gt;10.1364/OE.586098&lt;/electronic-resource-num&gt;&lt;/record&gt;&lt;/Cite&gt;&lt;/EndNote&gt;</w:instrText>
+      </w:r>
+      <w:r>
+        <w:rPr>
+          <w:rFonts w:asciiTheme="minorHAnsi" w:hAnsiTheme="minorHAnsi" w:cstheme="minorHAnsi"/>
+          <w:sz w:val="22"/>
+          <w:szCs w:val="22"/>
+          <w:highlight w:val="yellow"/>
+          <w:lang w:bidi="th-TH"/>
+        </w:rPr>
+        <w:fldChar w:fldCharType="separate"/>
+      </w:r>
+      <w:r>
+        <w:rPr>
+          <w:rFonts w:asciiTheme="minorHAnsi" w:hAnsiTheme="minorHAnsi" w:cstheme="minorHAnsi"/>
+          <w:noProof/>
+          <w:sz w:val="22"/>
+          <w:szCs w:val="22"/>
+          <w:highlight w:val="yellow"/>
+          <w:lang w:bidi="th-TH"/>
+        </w:rPr>
+        <w:t>[1]</w:t>
+      </w:r>
+      <w:r>
+        <w:rPr>
+          <w:rFonts w:asciiTheme="minorHAnsi" w:hAnsiTheme="minorHAnsi" w:cstheme="minorHAnsi"/>
+          <w:sz w:val="22"/>
+          <w:szCs w:val="22"/>
+          <w:highlight w:val="yellow"/>
+          <w:lang w:bidi="th-TH"/>
+        </w:rPr>
+        <w:fldChar w:fldCharType="end"/>
+      </w:r>
+      <w:r>
+        <w:rPr>
+          <w:rFonts w:asciiTheme="minorHAnsi" w:hAnsiTheme="minorHAnsi" w:cstheme="minorHAnsi"/>
+          <w:sz w:val="22"/>
+          <w:szCs w:val="22"/>
+          <w:lang w:bidi="th-TH"/>
+        </w:rPr>
+        <w:t>, FP-cavity VO</w:t>
+      </w:r>
+      <w:r>
+        <w:rPr>
+          <w:rFonts w:asciiTheme="minorHAnsi" w:hAnsiTheme="minorHAnsi" w:cstheme="minorHAnsi"/>
+          <w:sz w:val="22"/>
+          <w:szCs w:val="22"/>
+          <w:vertAlign w:val="subscript"/>
+          <w:lang w:bidi="th-TH"/>
+        </w:rPr>
+        <w:t>2</w:t>
+      </w:r>
+      <w:r>
+        <w:rPr>
+          <w:rFonts w:asciiTheme="minorHAnsi" w:hAnsiTheme="minorHAnsi" w:cstheme="minorHAnsi"/>
+          <w:sz w:val="22"/>
+          <w:szCs w:val="22"/>
+          <w:lang w:bidi="th-TH"/>
+        </w:rPr>
+        <w:t xml:space="preserve">-P4VP-based filter for 1064 nm usage </w:t>
+      </w:r>
+      <w:r>
+        <w:rPr>
+          <w:rFonts w:asciiTheme="minorHAnsi" w:hAnsiTheme="minorHAnsi" w:cstheme="minorHAnsi"/>
+          <w:sz w:val="22"/>
+          <w:szCs w:val="22"/>
+          <w:highlight w:val="yellow"/>
+          <w:lang w:bidi="th-TH"/>
+        </w:rPr>
+        <w:fldChar w:fldCharType="begin"/>
+      </w:r>
+      <w:r>
+        <w:rPr>
+          <w:rFonts w:asciiTheme="minorHAnsi" w:hAnsiTheme="minorHAnsi" w:cstheme="minorHAnsi"/>
+          <w:sz w:val="22"/>
+          <w:szCs w:val="22"/>
+          <w:highlight w:val="yellow"/>
+          <w:lang w:bidi="th-TH"/>
+        </w:rPr>
+        <w:instrText xml:space="preserve"> ADDIN EN.CITE &lt;EndNote&gt;&lt;Cite&gt;&lt;Author&gt;Liu&lt;/Author&gt;&lt;Year&gt;2024&lt;/Year&gt;&lt;RecNum&gt;116&lt;/RecNum&gt;&lt;DisplayText&gt;[2]&lt;/DisplayText&gt;&lt;record&gt;&lt;rec-number&gt;116&lt;/rec-number&gt;&lt;foreign-keys&gt;&lt;key app="EN" db-id="v920pft06rp9dbex2ap500x99x5rrtswxzss" timestamp="1785927749"&gt;116&lt;/key&gt;&lt;/foreign-keys&gt;&lt;ref-type name="Journal Article"&gt;17&lt;/ref-type&gt;&lt;contributors&gt;&lt;authors&gt;&lt;author&gt;Liu, Yu&lt;/author&gt;&lt;author&gt;Liu, Anqi&lt;/author&gt;&lt;author&gt;Li, Bolin&lt;/author&gt;&lt;author&gt;Yang, Yi&lt;/author&gt;&lt;author&gt;Feng, Junzhe&lt;/author&gt;&lt;author&gt;Wu, Yizhang&lt;/author&gt;&lt;author&gt;Lu, Min&lt;/author&gt;&lt;author&gt;Zhang, Yu&lt;/author&gt;&lt;author&gt;Bai, Xue&lt;/author&gt;&lt;author&gt;Chen, Yongyi&lt;/author&gt;&lt;/authors&gt;&lt;/contributors&gt;&lt;titles&gt;&lt;title&gt;Design of near-infrared solid-state tunable Fabry-Perot filters based on VO2/P4VP films&lt;/title&gt;&lt;secondary-title&gt;Optics Express&lt;/secondary-title&gt;&lt;alt-title&gt;Opt. Express&lt;/alt-title&gt;&lt;/titles&gt;&lt;periodical&gt;&lt;full-title&gt;Optics Express&lt;/full-title&gt;&lt;abbr-1&gt;Opt. Express&lt;/abbr-1&gt;&lt;/periodical&gt;&lt;alt-periodical&gt;&lt;full-title&gt;Optics Express&lt;/full-title&gt;&lt;abbr-1&gt;Opt. Express&lt;/abbr-1&gt;&lt;/alt-periodical&gt;&lt;pages&gt;32585-32596&lt;/pages&gt;&lt;volume&gt;32&lt;/volume&gt;&lt;number&gt;19&lt;/number&gt;&lt;keywords&gt;&lt;keyword&gt;Bandpass filters&lt;/keyword&gt;&lt;keyword&gt;Nematic liquid crystals&lt;/keyword&gt;&lt;keyword&gt;Optical filters&lt;/keyword&gt;&lt;keyword&gt;Optical materials&lt;/keyword&gt;&lt;keyword&gt;Refractive index&lt;/keyword&gt;&lt;keyword&gt;Tunable filters&lt;/keyword&gt;&lt;/keywords&gt;&lt;dates&gt;&lt;year&gt;2024&lt;/year&gt;&lt;pub-dates&gt;&lt;date&gt;2024/09/09&lt;/date&gt;&lt;/pub-dates&gt;&lt;/dates&gt;&lt;publisher&gt;Optica Publishing Group&lt;/publisher&gt;&lt;urls&gt;&lt;related-urls&gt;&lt;url&gt;https://opg.optica.org/oe/abstract.cfm?URI=oe-32-19-32585&lt;/url&gt;&lt;/related-urls&gt;&lt;/urls&gt;&lt;electronic-resource-num&gt;10.1364/OE.530226&lt;/electronic-resource-num&gt;&lt;/record&gt;&lt;/Cite&gt;&lt;/EndNote&gt;</w:instrText>
+      </w:r>
+      <w:r>
+        <w:rPr>
+          <w:rFonts w:asciiTheme="minorHAnsi" w:hAnsiTheme="minorHAnsi" w:cstheme="minorHAnsi"/>
+          <w:sz w:val="22"/>
+          <w:szCs w:val="22"/>
+          <w:highlight w:val="yellow"/>
+          <w:lang w:bidi="th-TH"/>
+        </w:rPr>
+        <w:fldChar w:fldCharType="separate"/>
+      </w:r>
+      <w:r>
+        <w:rPr>
+          <w:rFonts w:asciiTheme="minorHAnsi" w:hAnsiTheme="minorHAnsi" w:cstheme="minorHAnsi"/>
+          <w:noProof/>
+          <w:sz w:val="22"/>
+          <w:szCs w:val="22"/>
+          <w:highlight w:val="yellow"/>
+          <w:lang w:bidi="th-TH"/>
+        </w:rPr>
+        <w:t>[2]</w:t>
+      </w:r>
+      <w:r>
+        <w:rPr>
+          <w:rFonts w:asciiTheme="minorHAnsi" w:hAnsiTheme="minorHAnsi" w:cstheme="minorHAnsi"/>
+          <w:sz w:val="22"/>
+          <w:szCs w:val="22"/>
+          <w:highlight w:val="yellow"/>
+          <w:lang w:bidi="th-TH"/>
+        </w:rPr>
+        <w:fldChar w:fldCharType="end"/>
+      </w:r>
+      <w:r>
+        <w:rPr>
+          <w:rFonts w:asciiTheme="minorHAnsi" w:hAnsiTheme="minorHAnsi" w:cstheme="minorHAnsi"/>
+          <w:sz w:val="22"/>
+          <w:szCs w:val="22"/>
+          <w:lang w:bidi="th-TH"/>
+        </w:rPr>
+        <w:t xml:space="preserve">.  GSST-based filter </w:t>
+      </w:r>
+      <w:r>
+        <w:rPr>
+          <w:rFonts w:asciiTheme="minorHAnsi" w:hAnsiTheme="minorHAnsi" w:cstheme="minorHAnsi"/>
+          <w:sz w:val="22"/>
+          <w:szCs w:val="22"/>
+          <w:highlight w:val="yellow"/>
+          <w:lang w:bidi="th-TH"/>
+        </w:rPr>
+        <w:fldChar w:fldCharType="begin"/>
+      </w:r>
+      <w:r>
+        <w:rPr>
+          <w:rFonts w:asciiTheme="minorHAnsi" w:hAnsiTheme="minorHAnsi" w:cstheme="minorHAnsi"/>
+          <w:sz w:val="22"/>
+          <w:szCs w:val="22"/>
+          <w:highlight w:val="yellow"/>
+          <w:lang w:bidi="th-TH"/>
+        </w:rPr>
+        <w:instrText xml:space="preserve"> ADDIN EN.CITE &lt;EndNote&gt;&lt;Cite&gt;&lt;Author&gt;Heenkenda&lt;/Author&gt;&lt;Year&gt;2021&lt;/Year&gt;&lt;RecNum&gt;14&lt;/RecNum&gt;&lt;DisplayText&gt;[3]&lt;/DisplayText&gt;&lt;record&gt;&lt;rec-number&gt;14&lt;/rec-number&gt;&lt;foreign-keys&gt;&lt;key app="EN" db-id="v920pft06rp9dbex2ap500x99x5rrtswxzss" timestamp="1768014114" guid="0823d4a3-1d9a-4e38-8e22-f7e7aa673f3d"&gt;14&lt;/key&gt;&lt;/foreign-keys&gt;&lt;ref-type name="Journal Article"&gt;17&lt;/ref-type&gt;&lt;contributors&gt;&lt;authors&gt;&lt;author&gt;Heenkenda, Remona&lt;/author&gt;&lt;author&gt;Hirakawa, Keigo&lt;/author&gt;&lt;author&gt;Sarangan, Andrew&lt;/author&gt;&lt;/authors&gt;&lt;/contributors&gt;&lt;titles&gt;&lt;title&gt;Tunable optical filter using phase change materials for smart IR night vision applications&lt;/title&gt;&lt;secondary-title&gt;Optics Express&lt;/secondary-title&gt;&lt;alt-title&gt;Opt. Express&lt;/alt-title&gt;&lt;/titles&gt;&lt;periodical&gt;&lt;full-title&gt;Optics Express&lt;/full-title&gt;&lt;abbr-1&gt;Opt. Express&lt;/abbr-1&gt;&lt;/periodical&gt;&lt;alt-periodical&gt;&lt;full-title&gt;Optics Express&lt;/full-title&gt;&lt;abbr-1&gt;Opt. Express&lt;/abbr-1&gt;&lt;/alt-periodical&gt;&lt;pages&gt;33795-33803&lt;/pages&gt;&lt;volume&gt;29&lt;/volume&gt;&lt;number&gt;21&lt;/number&gt;&lt;keywords&gt;&lt;keyword&gt;CMOS cameras&lt;/keyword&gt;&lt;keyword&gt;Imaging systems&lt;/keyword&gt;&lt;keyword&gt;Optical data storage&lt;/keyword&gt;&lt;keyword&gt;Optical filters&lt;/keyword&gt;&lt;keyword&gt;Optical materials&lt;/keyword&gt;&lt;keyword&gt;Tunable filters&lt;/keyword&gt;&lt;/keywords&gt;&lt;dates&gt;&lt;year&gt;2021&lt;/year&gt;&lt;pub-dates&gt;&lt;date&gt;2021/10/11&lt;/date&gt;&lt;/pub-dates&gt;&lt;/dates&gt;&lt;publisher&gt;Optica Publishing Group&lt;/publisher&gt;&lt;urls&gt;&lt;related-urls&gt;&lt;url&gt;https://opg.optica.org/oe/abstract.cfm?URI=oe-29-21-33795&lt;/url&gt;&lt;/related-urls&gt;&lt;/urls&gt;&lt;electronic-resource-num&gt;10.1364/OE.440299&lt;/electronic-resource-num&gt;&lt;/record&gt;&lt;/Cite&gt;&lt;/EndNote&gt;</w:instrText>
+      </w:r>
+      <w:r>
+        <w:rPr>
+          <w:rFonts w:asciiTheme="minorHAnsi" w:hAnsiTheme="minorHAnsi" w:cstheme="minorHAnsi"/>
+          <w:sz w:val="22"/>
+          <w:szCs w:val="22"/>
+          <w:highlight w:val="yellow"/>
+          <w:lang w:bidi="th-TH"/>
+        </w:rPr>
+        <w:fldChar w:fldCharType="separate"/>
+      </w:r>
+      <w:r>
+        <w:rPr>
+          <w:rFonts w:asciiTheme="minorHAnsi" w:hAnsiTheme="minorHAnsi" w:cstheme="minorHAnsi"/>
+          <w:noProof/>
+          <w:sz w:val="22"/>
+          <w:szCs w:val="22"/>
+          <w:highlight w:val="yellow"/>
+          <w:lang w:bidi="th-TH"/>
+        </w:rPr>
+        <w:t>[3]</w:t>
+      </w:r>
+      <w:r>
+        <w:rPr>
+          <w:rFonts w:asciiTheme="minorHAnsi" w:hAnsiTheme="minorHAnsi" w:cstheme="minorHAnsi"/>
+          <w:sz w:val="22"/>
+          <w:szCs w:val="22"/>
+          <w:highlight w:val="yellow"/>
+          <w:lang w:bidi="th-TH"/>
+        </w:rPr>
+        <w:fldChar w:fldCharType="end"/>
+      </w:r>
+      <w:r>
+        <w:rPr>
+          <w:rFonts w:asciiTheme="minorHAnsi" w:hAnsiTheme="minorHAnsi" w:cstheme="minorHAnsi"/>
+          <w:sz w:val="22"/>
+          <w:szCs w:val="22"/>
+          <w:lang w:bidi="th-TH"/>
+        </w:rPr>
+        <w:t>, Sb</w:t>
+      </w:r>
+      <w:r>
+        <w:rPr>
+          <w:rFonts w:asciiTheme="minorHAnsi" w:hAnsiTheme="minorHAnsi" w:cstheme="minorHAnsi"/>
+          <w:sz w:val="22"/>
+          <w:szCs w:val="22"/>
+          <w:vertAlign w:val="subscript"/>
+          <w:lang w:bidi="th-TH"/>
+        </w:rPr>
+        <w:t>2</w:t>
+      </w:r>
+      <w:r>
+        <w:rPr>
+          <w:rFonts w:asciiTheme="minorHAnsi" w:hAnsiTheme="minorHAnsi" w:cstheme="minorHAnsi"/>
+          <w:sz w:val="22"/>
+          <w:szCs w:val="22"/>
+          <w:lang w:bidi="th-TH"/>
+        </w:rPr>
+        <w:t>Se</w:t>
+      </w:r>
+      <w:r>
+        <w:rPr>
+          <w:rFonts w:asciiTheme="minorHAnsi" w:hAnsiTheme="minorHAnsi" w:cstheme="minorHAnsi"/>
+          <w:sz w:val="22"/>
+          <w:szCs w:val="22"/>
+          <w:vertAlign w:val="subscript"/>
+          <w:lang w:bidi="th-TH"/>
+        </w:rPr>
+        <w:t>3</w:t>
+      </w:r>
+      <w:r>
+        <w:rPr>
+          <w:rFonts w:asciiTheme="minorHAnsi" w:hAnsiTheme="minorHAnsi" w:cstheme="minorHAnsi"/>
+          <w:sz w:val="22"/>
+          <w:szCs w:val="22"/>
+          <w:lang w:bidi="th-TH"/>
+        </w:rPr>
+        <w:t>-based waveguide switch (common usage of Sb</w:t>
+      </w:r>
+      <w:r>
+        <w:rPr>
+          <w:rFonts w:asciiTheme="minorHAnsi" w:hAnsiTheme="minorHAnsi" w:cstheme="minorHAnsi"/>
+          <w:sz w:val="22"/>
+          <w:szCs w:val="22"/>
+          <w:vertAlign w:val="subscript"/>
+          <w:lang w:bidi="th-TH"/>
+        </w:rPr>
+        <w:t>2</w:t>
+      </w:r>
+      <w:r>
+        <w:rPr>
+          <w:rFonts w:asciiTheme="minorHAnsi" w:hAnsiTheme="minorHAnsi" w:cstheme="minorHAnsi"/>
+          <w:sz w:val="22"/>
+          <w:szCs w:val="22"/>
+          <w:lang w:bidi="th-TH"/>
+        </w:rPr>
+        <w:t>Se</w:t>
+      </w:r>
+      <w:r>
+        <w:rPr>
+          <w:rFonts w:asciiTheme="minorHAnsi" w:hAnsiTheme="minorHAnsi" w:cstheme="minorHAnsi"/>
+          <w:sz w:val="22"/>
+          <w:szCs w:val="22"/>
+          <w:vertAlign w:val="subscript"/>
+          <w:lang w:bidi="th-TH"/>
+        </w:rPr>
+        <w:t xml:space="preserve">3 </w:t>
+      </w:r>
+      <w:r>
+        <w:rPr>
+          <w:rFonts w:asciiTheme="minorHAnsi" w:hAnsiTheme="minorHAnsi" w:cstheme="minorHAnsi"/>
+          <w:sz w:val="22"/>
+          <w:szCs w:val="22"/>
+          <w:lang w:bidi="th-TH"/>
+        </w:rPr>
+        <w:t xml:space="preserve">devices) </w:t>
+      </w:r>
+      <w:r>
+        <w:rPr>
+          <w:rFonts w:asciiTheme="minorHAnsi" w:hAnsiTheme="minorHAnsi" w:cstheme="minorHAnsi"/>
+          <w:sz w:val="22"/>
+          <w:szCs w:val="22"/>
+          <w:highlight w:val="yellow"/>
+          <w:lang w:bidi="th-TH"/>
+        </w:rPr>
+        <w:fldChar w:fldCharType="begin"/>
+      </w:r>
+      <w:r>
+        <w:rPr>
+          <w:rFonts w:asciiTheme="minorHAnsi" w:hAnsiTheme="minorHAnsi" w:cstheme="minorHAnsi"/>
+          <w:sz w:val="22"/>
+          <w:szCs w:val="22"/>
+          <w:highlight w:val="yellow"/>
+          <w:lang w:bidi="th-TH"/>
+        </w:rPr>
+        <w:instrText xml:space="preserve"> ADDIN EN.CITE &lt;EndNote&gt;&lt;Cite&gt;&lt;Author&gt;Zhang&lt;/Author&gt;&lt;Year&gt;2023&lt;/Year&gt;&lt;RecNum&gt;115&lt;/RecNum&gt;&lt;DisplayText&gt;[4]&lt;/DisplayText&gt;&lt;record&gt;&lt;rec-number&gt;115&lt;/rec-number&gt;&lt;foreign-keys&gt;&lt;key app="EN" db-id="v920pft06rp9dbex2ap500x99x5rrtswxzss" timestamp="1785917735"&gt;115&lt;/key&gt;&lt;/foreign-keys&gt;&lt;ref-type name="Journal Article"&gt;17&lt;/ref-type&gt;&lt;contributors&gt;&lt;authors&gt;&lt;author&gt;Zhang, Qianru&lt;/author&gt;&lt;author&gt;Hong, Qilin&lt;/author&gt;&lt;author&gt;Zhu, Zhihong&lt;/author&gt;&lt;/authors&gt;&lt;/contributors&gt;&lt;titles&gt;&lt;title&gt;Low-loss Optical Switching Based on Phase-change Material Sb2Se3 in a Micro-ring Resonator&lt;/title&gt;&lt;secondary-title&gt;Journal of Physics: Conference Series&lt;/secondary-title&gt;&lt;/titles&gt;&lt;periodical&gt;&lt;full-title&gt;Journal of Physics: Conference Series&lt;/full-title&gt;&lt;/periodical&gt;&lt;pages&gt;012020&lt;/pages&gt;&lt;volume&gt;2597&lt;/volume&gt;&lt;dates&gt;&lt;year&gt;2023&lt;/year&gt;&lt;pub-dates&gt;&lt;date&gt;09/01&lt;/date&gt;&lt;/pub-dates&gt;&lt;/dates&gt;&lt;urls&gt;&lt;/urls&gt;&lt;electronic-resource-num&gt;10.1088/1742-6596/2597/1/012020&lt;/electronic-resource-num&gt;&lt;/record&gt;&lt;/Cite&gt;&lt;/EndNote&gt;</w:instrText>
+      </w:r>
+      <w:r>
+        <w:rPr>
+          <w:rFonts w:asciiTheme="minorHAnsi" w:hAnsiTheme="minorHAnsi" w:cstheme="minorHAnsi"/>
+          <w:sz w:val="22"/>
+          <w:szCs w:val="22"/>
+          <w:highlight w:val="yellow"/>
+          <w:lang w:bidi="th-TH"/>
+        </w:rPr>
+        <w:fldChar w:fldCharType="separate"/>
+      </w:r>
+      <w:r>
+        <w:rPr>
+          <w:rFonts w:asciiTheme="minorHAnsi" w:hAnsiTheme="minorHAnsi" w:cstheme="minorHAnsi"/>
+          <w:noProof/>
+          <w:sz w:val="22"/>
+          <w:szCs w:val="22"/>
+          <w:highlight w:val="yellow"/>
+          <w:lang w:bidi="th-TH"/>
+        </w:rPr>
+        <w:t>[4]</w:t>
+      </w:r>
+      <w:r>
+        <w:rPr>
+          <w:rFonts w:asciiTheme="minorHAnsi" w:hAnsiTheme="minorHAnsi" w:cstheme="minorHAnsi"/>
+          <w:sz w:val="22"/>
+          <w:szCs w:val="22"/>
+          <w:highlight w:val="yellow"/>
+          <w:lang w:bidi="th-TH"/>
+        </w:rPr>
+        <w:fldChar w:fldCharType="end"/>
+      </w:r>
+      <w:r>
+        <w:rPr>
+          <w:rFonts w:asciiTheme="minorHAnsi" w:hAnsiTheme="minorHAnsi" w:cstheme="minorHAnsi"/>
+          <w:sz w:val="22"/>
+          <w:szCs w:val="22"/>
+          <w:lang w:bidi="th-TH"/>
+        </w:rPr>
+        <w:t xml:space="preserve">, GST-based long-pass edge-filter optical limiter (similar design architecture) </w:t>
+      </w:r>
+      <w:r>
+        <w:rPr>
+          <w:rFonts w:asciiTheme="minorHAnsi" w:hAnsiTheme="minorHAnsi" w:cstheme="minorHAnsi"/>
+          <w:sz w:val="22"/>
+          <w:szCs w:val="22"/>
+          <w:highlight w:val="yellow"/>
+          <w:lang w:bidi="th-TH"/>
+        </w:rPr>
+        <w:fldChar w:fldCharType="begin"/>
+      </w:r>
+      <w:r>
+        <w:rPr>
+          <w:rFonts w:asciiTheme="minorHAnsi" w:hAnsiTheme="minorHAnsi" w:cstheme="minorHAnsi"/>
+          <w:sz w:val="22"/>
+          <w:szCs w:val="22"/>
+          <w:highlight w:val="yellow"/>
+          <w:lang w:bidi="th-TH"/>
+        </w:rPr>
+        <w:instrText xml:space="preserve"> ADDIN EN.CITE &lt;EndNote&gt;&lt;Cite&gt;&lt;Author&gt;Sarangan&lt;/Author&gt;&lt;Year&gt;2018&lt;/Year&gt;&lt;RecNum&gt;58&lt;/RecNum&gt;&lt;DisplayText&gt;[5]&lt;/DisplayText&gt;&lt;record&gt;&lt;rec-number&gt;58&lt;/rec-number&gt;&lt;foreign-keys&gt;&lt;key app="EN" db-id="v920pft06rp9dbex2ap500x99x5rrtswxzss" timestamp="1768052832" guid="764f485b-7b33-40ca-84f4-64e260740b05"&gt;58&lt;/key&gt;&lt;/foreign-keys&gt;&lt;ref-type name="Journal Article"&gt;17&lt;/ref-type&gt;&lt;contributors&gt;&lt;authors&gt;&lt;author&gt;Sarangan, Andrew&lt;/author&gt;&lt;author&gt;Duran, Josh&lt;/author&gt;&lt;author&gt;Vasilyev, Vladimir&lt;/author&gt;&lt;author&gt;Limberopoulos, Nicholaos&lt;/author&gt;&lt;author&gt;Vitebskiy, Ilya&lt;/author&gt;&lt;author&gt;Anisimov, Igor&lt;/author&gt;&lt;/authors&gt;&lt;/contributors&gt;&lt;titles&gt;&lt;title&gt;Broadband Reflective Optical Limiter Using GST Phase Change Material&lt;/title&gt;&lt;secondary-title&gt;IEEE Photonics Journal&lt;/secondary-title&gt;&lt;/titles&gt;&lt;periodical&gt;&lt;full-title&gt;IEEE Photonics Journal&lt;/full-title&gt;&lt;/periodical&gt;&lt;pages&gt;1-9&lt;/pages&gt;&lt;volume&gt;10&lt;/volume&gt;&lt;number&gt;2&lt;/number&gt;&lt;section&gt;1&lt;/section&gt;&lt;keywords&gt;&lt;keyword&gt;Nonlinear optics&lt;/keyword&gt;&lt;keyword&gt;Annealing&lt;/keyword&gt;&lt;keyword&gt;Optical device fabrication&lt;/keyword&gt;&lt;keyword&gt;Optical sensors&lt;/keyword&gt;&lt;keyword&gt;Optical refraction&lt;/keyword&gt;&lt;keyword&gt;Optical materials&lt;/keyword&gt;&lt;keyword&gt;Phase change materials&lt;/keyword&gt;&lt;keyword&gt;Optical properties of photonic materials&lt;/keyword&gt;&lt;keyword&gt;multilayer interference coatings&lt;/keyword&gt;&lt;keyword&gt;fabrication and characterization&lt;/keyword&gt;&lt;keyword&gt;photonic bandgap structures&lt;/keyword&gt;&lt;/keywords&gt;&lt;dates&gt;&lt;year&gt;2018&lt;/year&gt;&lt;/dates&gt;&lt;isbn&gt;1943-0655&lt;/isbn&gt;&lt;urls&gt;&lt;related-urls&gt;&lt;url&gt;https://ieeexplore.ieee.org/ielx7/4563994/8302353/08265175.pdf?tp=&amp;amp;arnumber=8265175&amp;amp;isnumber=8302353&amp;amp;ref=&lt;/url&gt;&lt;/related-urls&gt;&lt;/urls&gt;&lt;electronic-resource-num&gt;10.1109/jphot.2018.2796448&lt;/electronic-resource-num&gt;&lt;/record&gt;&lt;/Cite&gt;&lt;/EndNote&gt;</w:instrText>
+      </w:r>
+      <w:r>
+        <w:rPr>
+          <w:rFonts w:asciiTheme="minorHAnsi" w:hAnsiTheme="minorHAnsi" w:cstheme="minorHAnsi"/>
+          <w:sz w:val="22"/>
+          <w:szCs w:val="22"/>
+          <w:highlight w:val="yellow"/>
+          <w:lang w:bidi="th-TH"/>
+        </w:rPr>
+        <w:fldChar w:fldCharType="separate"/>
+      </w:r>
+      <w:r>
+        <w:rPr>
+          <w:rFonts w:asciiTheme="minorHAnsi" w:hAnsiTheme="minorHAnsi" w:cstheme="minorHAnsi"/>
+          <w:noProof/>
+          <w:sz w:val="22"/>
+          <w:szCs w:val="22"/>
+          <w:highlight w:val="yellow"/>
+          <w:lang w:bidi="th-TH"/>
+        </w:rPr>
+        <w:t>[5]</w:t>
+      </w:r>
+      <w:r>
+        <w:rPr>
+          <w:rFonts w:asciiTheme="minorHAnsi" w:hAnsiTheme="minorHAnsi" w:cstheme="minorHAnsi"/>
+          <w:sz w:val="22"/>
+          <w:szCs w:val="22"/>
+          <w:highlight w:val="yellow"/>
+          <w:lang w:bidi="th-TH"/>
+        </w:rPr>
+        <w:fldChar w:fldCharType="end"/>
+      </w:r>
+      <w:r>
+        <w:rPr>
+          <w:rFonts w:asciiTheme="minorHAnsi" w:hAnsiTheme="minorHAnsi" w:cstheme="minorHAnsi"/>
+          <w:sz w:val="22"/>
+          <w:szCs w:val="22"/>
+          <w:lang w:bidi="th-TH"/>
+        </w:rPr>
+        <w:t xml:space="preserve">, and non-PCM antireflection optical coatings </w:t>
+      </w:r>
+      <w:r>
+        <w:rPr>
+          <w:rFonts w:asciiTheme="minorHAnsi" w:hAnsiTheme="minorHAnsi" w:cstheme="minorHAnsi"/>
+          <w:sz w:val="22"/>
+          <w:szCs w:val="22"/>
+          <w:highlight w:val="yellow"/>
+          <w:lang w:bidi="th-TH"/>
+        </w:rPr>
+        <w:fldChar w:fldCharType="begin"/>
+      </w:r>
+      <w:r>
+        <w:rPr>
+          <w:rFonts w:asciiTheme="minorHAnsi" w:hAnsiTheme="minorHAnsi" w:cstheme="minorHAnsi"/>
+          <w:sz w:val="22"/>
+          <w:szCs w:val="22"/>
+          <w:highlight w:val="yellow"/>
+          <w:lang w:bidi="th-TH"/>
+        </w:rPr>
+        <w:instrText xml:space="preserve"> ADDIN EN.CITE &lt;EndNote&gt;&lt;Cite&gt;&lt;Author&gt;Patel&lt;/Author&gt;&lt;Year&gt;2020&lt;/Year&gt;&lt;RecNum&gt;84&lt;/RecNum&gt;&lt;DisplayText&gt;[6]&lt;/DisplayText&gt;&lt;record&gt;&lt;rec-number&gt;84&lt;/rec-number&gt;&lt;foreign-keys&gt;&lt;key app="EN" db-id="v920pft06rp9dbex2ap500x99x5rrtswxzss" timestamp="1773906072" guid="b9a587cd-cc95-4d16-b69c-7644278fcb2e"&gt;84&lt;/key&gt;&lt;/foreign-keys&gt;&lt;ref-type name="Journal Article"&gt;17&lt;/ref-type&gt;&lt;contributors&gt;&lt;authors&gt;&lt;author&gt;Patel, Rupali&lt;/author&gt;&lt;author&gt;Patel, Nainesh&lt;/author&gt;&lt;author&gt;Bazzanella, Nicola&lt;/author&gt;&lt;author&gt;Miotello, Antonio&lt;/author&gt;&lt;/authors&gt;&lt;/contributors&gt;&lt;titles&gt;&lt;title&gt;Fabricating multilayer antireflective coating for near complete transmittance in broadband visible light spectrum&lt;/title&gt;&lt;secondary-title&gt;Optical Materials&lt;/secondary-title&gt;&lt;/titles&gt;&lt;periodical&gt;&lt;full-title&gt;Optical Materials&lt;/full-title&gt;&lt;/periodical&gt;&lt;pages&gt;110415&lt;/pages&gt;&lt;volume&gt;108&lt;/volume&gt;&lt;keywords&gt;&lt;keyword&gt;Antireflective coating&lt;/keyword&gt;&lt;keyword&gt;Multilayer&lt;/keyword&gt;&lt;keyword&gt;Refractive index&lt;/keyword&gt;&lt;keyword&gt;RF-magnetron sputtering&lt;/keyword&gt;&lt;keyword&gt;Near-zero transmittance&lt;/keyword&gt;&lt;/keywords&gt;&lt;dates&gt;&lt;year&gt;2020&lt;/year&gt;&lt;pub-dates&gt;&lt;date&gt;2020/10/01/&lt;/date&gt;&lt;/pub-dates&gt;&lt;/dates&gt;&lt;isbn&gt;0925-3467&lt;/isbn&gt;&lt;urls&gt;&lt;related-urls&gt;&lt;url&gt;https://www.sciencedirect.com/science/article/pii/S0925346720307564&lt;/url&gt;&lt;/related-urls&gt;&lt;/urls&gt;&lt;electronic-resource-num&gt;https://doi.org/10.1016/j.optmat.2020.110415&lt;/electronic-resource-num&gt;&lt;/record&gt;&lt;/Cite&gt;&lt;/EndNote&gt;</w:instrText>
+      </w:r>
+      <w:r>
+        <w:rPr>
+          <w:rFonts w:asciiTheme="minorHAnsi" w:hAnsiTheme="minorHAnsi" w:cstheme="minorHAnsi"/>
+          <w:sz w:val="22"/>
+          <w:szCs w:val="22"/>
+          <w:highlight w:val="yellow"/>
+          <w:lang w:bidi="th-TH"/>
+        </w:rPr>
+        <w:fldChar w:fldCharType="separate"/>
+      </w:r>
+      <w:r>
+        <w:rPr>
+          <w:rFonts w:asciiTheme="minorHAnsi" w:hAnsiTheme="minorHAnsi" w:cstheme="minorHAnsi"/>
+          <w:noProof/>
+          <w:sz w:val="22"/>
+          <w:szCs w:val="22"/>
+          <w:highlight w:val="yellow"/>
+          <w:lang w:bidi="th-TH"/>
+        </w:rPr>
+        <w:t>[6]</w:t>
+      </w:r>
+      <w:r>
+        <w:rPr>
+          <w:rFonts w:asciiTheme="minorHAnsi" w:hAnsiTheme="minorHAnsi" w:cstheme="minorHAnsi"/>
+          <w:sz w:val="22"/>
+          <w:szCs w:val="22"/>
+          <w:highlight w:val="yellow"/>
+          <w:lang w:bidi="th-TH"/>
+        </w:rPr>
+        <w:fldChar w:fldCharType="end"/>
+      </w:r>
+      <w:r>
+        <w:rPr>
+          <w:rFonts w:asciiTheme="minorHAnsi" w:hAnsiTheme="minorHAnsi" w:cstheme="minorHAnsi"/>
+          <w:sz w:val="22"/>
+          <w:szCs w:val="22"/>
+          <w:lang w:bidi="th-TH"/>
         </w:rPr>
         <w:t>.</w:t>
       </w:r>
@@ -5803,6 +6699,7 @@
         <w:jc w:val="both"/>
         <w:rPr>
           <w:rFonts w:ascii="Calibri" w:hAnsi="Calibri"/>
+          <w:bCs/>
           <w:sz w:val="22"/>
           <w:szCs w:val="22"/>
         </w:rPr>
@@ -5824,6 +6721,15 @@
           <w:szCs w:val="22"/>
         </w:rPr>
         <w:t xml:space="preserve"> </w:t>
+      </w:r>
+      <w:r>
+        <w:rPr>
+          <w:rFonts w:ascii="Calibri" w:hAnsi="Calibri"/>
+          <w:bCs/>
+          <w:sz w:val="22"/>
+          <w:szCs w:val="22"/>
+        </w:rPr>
+        <w:t>A section and table have been added to “IV.D. COMPARISON WITH OTHER OPTICAL DEVICES”. The comparison criteria are the same as Table I.</w:t>
       </w:r>
     </w:p>
     <w:p>
@@ -6626,6 +7532,7 @@
           <w:sz w:val="22"/>
           <w:szCs w:val="22"/>
         </w:rPr>
+        <w:lastRenderedPageBreak/>
         <w:t>Author action:</w:t>
       </w:r>
       <w:r>
@@ -6693,28 +7600,19 @@
           <w:rFonts w:ascii="Calibri" w:hAnsi="Calibri"/>
           <w:b/>
           <w:bCs/>
-          <w:color w:val="008000"/>
-          <w:sz w:val="22"/>
-          <w:szCs w:val="22"/>
-        </w:rPr>
-        <w:t>Reviewer#</w:t>
-      </w:r>
-      <w:r>
-        <w:rPr>
-          <w:rFonts w:ascii="Calibri" w:hAnsi="Calibri"/>
-          <w:b/>
-          <w:bCs/>
-          <w:color w:val="008000"/>
-          <w:sz w:val="22"/>
-          <w:szCs w:val="22"/>
-        </w:rPr>
-        <w:t xml:space="preserve">3, Concern # </w:t>
-      </w:r>
-      <w:r>
-        <w:rPr>
-          <w:rFonts w:ascii="Calibri" w:hAnsi="Calibri"/>
-          <w:b/>
-          <w:bCs/>
+          <w:strike/>
+          <w:color w:val="008000"/>
+          <w:sz w:val="22"/>
+          <w:szCs w:val="22"/>
+        </w:rPr>
+        <w:t xml:space="preserve">Reviewer#3, Concern # </w:t>
+      </w:r>
+      <w:r>
+        <w:rPr>
+          <w:rFonts w:ascii="Calibri" w:hAnsi="Calibri"/>
+          <w:b/>
+          <w:bCs/>
+          <w:strike/>
           <w:color w:val="008000"/>
           <w:sz w:val="22"/>
           <w:szCs w:val="22"/>
@@ -6854,7 +7752,6 @@
           <w:sz w:val="22"/>
           <w:szCs w:val="22"/>
         </w:rPr>
-        <w:lastRenderedPageBreak/>
         <w:t>Author action:</w:t>
       </w:r>
       <w:r>
@@ -6940,7 +7837,39 @@
           <w:sz w:val="22"/>
           <w:szCs w:val="22"/>
         </w:rPr>
-        <w:t>Thank you for your valuable suggestions. It’s greatly appreciated.</w:t>
+        <w:t>Thank you for your valuable suggestions</w:t>
+      </w:r>
+      <w:r>
+        <w:rPr>
+          <w:rFonts w:ascii="Calibri" w:hAnsi="Calibri"/>
+          <w:sz w:val="22"/>
+          <w:szCs w:val="22"/>
+        </w:rPr>
+        <w:t xml:space="preserve"> and raising an interesting point we missed</w:t>
+      </w:r>
+      <w:r>
+        <w:rPr>
+          <w:rFonts w:ascii="Calibri" w:hAnsi="Calibri"/>
+          <w:sz w:val="22"/>
+          <w:szCs w:val="22"/>
+        </w:rPr>
+        <w:t xml:space="preserve">. It’s </w:t>
+      </w:r>
+      <w:r>
+        <w:rPr>
+          <w:rFonts w:ascii="Calibri" w:hAnsi="Calibri"/>
+          <w:sz w:val="22"/>
+          <w:szCs w:val="22"/>
+        </w:rPr>
+        <w:t>highly</w:t>
+      </w:r>
+      <w:r>
+        <w:rPr>
+          <w:rFonts w:ascii="Calibri" w:hAnsi="Calibri"/>
+          <w:sz w:val="22"/>
+          <w:szCs w:val="22"/>
+        </w:rPr>
+        <w:t xml:space="preserve"> appreciated.</w:t>
       </w:r>
     </w:p>
     <w:p>
@@ -6998,22 +7927,23 @@
           <w:rFonts w:ascii="Calibri" w:hAnsi="Calibri"/>
           <w:b/>
           <w:bCs/>
-          <w:color w:val="008000"/>
-          <w:sz w:val="22"/>
-          <w:szCs w:val="22"/>
-        </w:rPr>
-        <w:t>Reviewer#</w:t>
-      </w:r>
-      <w:r>
-        <w:rPr>
-          <w:rFonts w:ascii="Calibri" w:hAnsi="Calibri"/>
-          <w:b/>
-          <w:bCs/>
-          <w:color w:val="008000"/>
-          <w:sz w:val="22"/>
-          <w:szCs w:val="22"/>
-        </w:rPr>
-        <w:t>4, Concern # 1 (</w:t>
+          <w:strike/>
+          <w:color w:val="008000"/>
+          <w:sz w:val="22"/>
+          <w:szCs w:val="22"/>
+        </w:rPr>
+        <w:t>Reviewer#4, Concern # 1</w:t>
+      </w:r>
+      <w:r>
+        <w:rPr>
+          <w:rFonts w:ascii="Calibri" w:hAnsi="Calibri"/>
+          <w:b/>
+          <w:bCs/>
+          <w:color w:val="008000"/>
+          <w:sz w:val="22"/>
+          <w:szCs w:val="22"/>
+        </w:rPr>
+        <w:t xml:space="preserve"> (</w:t>
       </w:r>
       <w:r>
         <w:rPr>
@@ -7147,7 +8077,23 @@
           <w:sz w:val="22"/>
           <w:szCs w:val="22"/>
         </w:rPr>
-        <w:t xml:space="preserve">continuously tunable, the </w:t>
+        <w:t>continuously tunable</w:t>
+      </w:r>
+      <w:r>
+        <w:rPr>
+          <w:rFonts w:ascii="Calibri" w:hAnsi="Calibri"/>
+          <w:sz w:val="22"/>
+          <w:szCs w:val="22"/>
+        </w:rPr>
+        <w:t xml:space="preserve"> or wavelength tuning</w:t>
+      </w:r>
+      <w:r>
+        <w:rPr>
+          <w:rFonts w:ascii="Calibri" w:hAnsi="Calibri"/>
+          <w:sz w:val="22"/>
+          <w:szCs w:val="22"/>
+        </w:rPr>
+        <w:t xml:space="preserve">, the </w:t>
       </w:r>
       <w:r>
         <w:rPr>
@@ -7245,7 +8191,34 @@
           <w:sz w:val="22"/>
           <w:szCs w:val="22"/>
         </w:rPr>
-        <w:t>The lack of switching methods or thermal simulations in this work are now written in IV.E. LIMITATIONS AND FUTURE WORKS SUGGESTIONS.</w:t>
+        <w:t xml:space="preserve">The lack of switching methods or thermal simulations in this work are now written in </w:t>
+      </w:r>
+      <w:r>
+        <w:rPr>
+          <w:rFonts w:ascii="Calibri" w:hAnsi="Calibri"/>
+          <w:bCs/>
+          <w:sz w:val="22"/>
+          <w:szCs w:val="22"/>
+        </w:rPr>
+        <w:t>“</w:t>
+      </w:r>
+      <w:r>
+        <w:rPr>
+          <w:rFonts w:ascii="Calibri" w:hAnsi="Calibri"/>
+          <w:bCs/>
+          <w:sz w:val="22"/>
+          <w:szCs w:val="22"/>
+        </w:rPr>
+        <w:t>IV.E. LIMITATIONS AND FUTURE WORKS SUGGESTIONS.</w:t>
+      </w:r>
+      <w:r>
+        <w:rPr>
+          <w:rFonts w:ascii="Calibri" w:hAnsi="Calibri"/>
+          <w:bCs/>
+          <w:sz w:val="22"/>
+          <w:szCs w:val="22"/>
+        </w:rPr>
+        <w:t>”</w:t>
       </w:r>
     </w:p>
     <w:p>
@@ -7404,7 +8377,39 @@
           <w:sz w:val="22"/>
           <w:szCs w:val="22"/>
         </w:rPr>
-        <w:t>We think the Reviewer misunderstand the meaning of tunability in this work. Transmittance tunability is the ability the change the transmittance values by switching the phase of Sb</w:t>
+        <w:t xml:space="preserve">We think the Reviewer misunderstand the meaning of tunability in this work. </w:t>
+      </w:r>
+      <w:r>
+        <w:rPr>
+          <w:rFonts w:ascii="Calibri" w:hAnsi="Calibri"/>
+          <w:sz w:val="22"/>
+          <w:szCs w:val="22"/>
+        </w:rPr>
+        <w:t>T</w:t>
+      </w:r>
+      <w:r>
+        <w:rPr>
+          <w:rFonts w:ascii="Calibri" w:hAnsi="Calibri"/>
+          <w:sz w:val="22"/>
+          <w:szCs w:val="22"/>
+        </w:rPr>
+        <w:t xml:space="preserve">ransmittance tunability is the ability the change the transmittance values </w:t>
+      </w:r>
+      <w:r>
+        <w:rPr>
+          <w:rFonts w:ascii="Calibri" w:hAnsi="Calibri"/>
+          <w:sz w:val="22"/>
+          <w:szCs w:val="22"/>
+        </w:rPr>
+        <w:t xml:space="preserve">at a specific wavelength </w:t>
+      </w:r>
+      <w:r>
+        <w:rPr>
+          <w:rFonts w:ascii="Calibri" w:hAnsi="Calibri"/>
+          <w:sz w:val="22"/>
+          <w:szCs w:val="22"/>
+        </w:rPr>
+        <w:t>by switching the phase of Sb</w:t>
       </w:r>
       <w:r>
         <w:rPr>
@@ -7438,14 +8443,19 @@
           <w:sz w:val="22"/>
           <w:szCs w:val="22"/>
         </w:rPr>
-        <w:t xml:space="preserve"> which does not specifically mean the tunability of wavelength. </w:t>
-      </w:r>
-    </w:p>
-    <w:p>
-      <w:pPr>
-        <w:tabs>
-          <w:tab w:val="left" w:pos="8135"/>
-        </w:tabs>
+        <w:t xml:space="preserve"> which does not </w:t>
+      </w:r>
+      <w:r>
+        <w:rPr>
+          <w:rFonts w:ascii="Calibri" w:hAnsi="Calibri"/>
+          <w:sz w:val="22"/>
+          <w:szCs w:val="22"/>
+        </w:rPr>
+        <w:t xml:space="preserve">necessary required the shifting of peak transmission wavelength. </w:t>
+      </w:r>
+    </w:p>
+    <w:p>
+      <w:pPr>
         <w:jc w:val="both"/>
         <w:rPr>
           <w:rFonts w:ascii="Calibri" w:hAnsi="Calibri"/>
@@ -7531,7 +8541,15 @@
           <w:sz w:val="22"/>
           <w:szCs w:val="22"/>
         </w:rPr>
-        <w:t>But a</w:t>
+        <w:t xml:space="preserve">Also, </w:t>
+      </w:r>
+      <w:r>
+        <w:rPr>
+          <w:rFonts w:ascii="Calibri" w:hAnsi="Calibri"/>
+          <w:sz w:val="22"/>
+          <w:szCs w:val="22"/>
+        </w:rPr>
+        <w:t>a</w:t>
       </w:r>
       <w:r>
         <w:rPr>
@@ -7602,25 +8620,16 @@
           <w:sz w:val="22"/>
           <w:szCs w:val="22"/>
         </w:rPr>
-        <w:t xml:space="preserve"> As </w:t>
-      </w:r>
-      <w:r>
-        <w:rPr>
-          <w:rFonts w:ascii="Calibri" w:hAnsi="Calibri"/>
-          <w:bCs/>
-          <w:sz w:val="22"/>
-          <w:szCs w:val="22"/>
-        </w:rPr>
-        <w:t>a</w:t>
-      </w:r>
-      <w:r>
-        <w:rPr>
-          <w:rFonts w:ascii="Calibri" w:hAnsi="Calibri"/>
-          <w:bCs/>
-          <w:sz w:val="22"/>
-          <w:szCs w:val="22"/>
-        </w:rPr>
-        <w:t xml:space="preserve"> response, we have not taken any direct action due to this concern.</w:t>
+        <w:t xml:space="preserve"> </w:t>
+      </w:r>
+      <w:r>
+        <w:rPr>
+          <w:rFonts w:ascii="Calibri" w:hAnsi="Calibri"/>
+          <w:bCs/>
+          <w:sz w:val="22"/>
+          <w:szCs w:val="22"/>
+        </w:rPr>
+        <w:t>As explained in the response, we decide to take no direct action to this comment.</w:t>
       </w:r>
     </w:p>
     <w:p>
@@ -7846,7 +8855,6 @@
           <w:sz w:val="22"/>
           <w:szCs w:val="22"/>
         </w:rPr>
-        <w:lastRenderedPageBreak/>
         <w:t>We haven’t thought about finite-thickness effects since recent work with even smaller Sb</w:t>
       </w:r>
       <w:r>
@@ -7897,7 +8905,7 @@
           <w:sz w:val="22"/>
           <w:szCs w:val="22"/>
         </w:rPr>
-        <w:instrText xml:space="preserve"> ADDIN EN.CITE &lt;EndNote&gt;&lt;Cite&gt;&lt;Author&gt;Blundell&lt;/Author&gt;&lt;Year&gt;2025&lt;/Year&gt;&lt;RecNum&gt;25&lt;/RecNum&gt;&lt;DisplayText&gt;[1]&lt;/DisplayText&gt;&lt;record&gt;&lt;rec-number&gt;25&lt;/rec-number&gt;&lt;foreign-keys&gt;&lt;key app="EN" db-id="v920pft06rp9dbex2ap500x99x5rrtswxzss" timestamp="1768016463" guid="83165567-b35a-4cd6-aa63-d20c0019cf44"&gt;25&lt;/key&gt;&lt;/foreign-keys&gt;&lt;ref-type name="Journal Article"&gt;17&lt;/ref-type&gt;&lt;contributors&gt;&lt;authors&gt;&lt;author&gt;Blundell, Sophie&lt;/author&gt;&lt;author&gt;Radford, Thomas W.&lt;/author&gt;&lt;author&gt;Ajia, Idris A.&lt;/author&gt;&lt;author&gt;Lawson, Daniel&lt;/author&gt;&lt;author&gt;Yan, Xingzhao&lt;/author&gt;&lt;author&gt;Banakar, Mehdi&lt;/author&gt;&lt;author&gt;Thomson, David J.&lt;/author&gt;&lt;author&gt;Zeimpekis, Ioannis&lt;/author&gt;&lt;author&gt;Muskens, Otto L.&lt;/author&gt;&lt;/authors&gt;&lt;/contributors&gt;&lt;titles&gt;&lt;title&gt;Ultracompact Programmable Silicon Photonics Using Layers of Low-Loss Phase-Change Material Sb2Se3 of Increasing Thickness&lt;/title&gt;&lt;secondary-title&gt;ACS Photonics&lt;/secondary-title&gt;&lt;/titles&gt;&lt;periodical&gt;&lt;full-title&gt;ACS Photonics&lt;/full-title&gt;&lt;/periodical&gt;&lt;pages&gt;1382-1391&lt;/pages&gt;&lt;volume&gt;12&lt;/volume&gt;&lt;number&gt;3&lt;/number&gt;&lt;dates&gt;&lt;year&gt;2025&lt;/year&gt;&lt;pub-dates&gt;&lt;date&gt;2025/03/19&lt;/date&gt;&lt;/pub-dates&gt;&lt;/dates&gt;&lt;publisher&gt;American Chemical Society&lt;/publisher&gt;&lt;urls&gt;&lt;related-urls&gt;&lt;url&gt;https://doi.org/10.1021/acsphotonics.4c01789&lt;/url&gt;&lt;/related-urls&gt;&lt;/urls&gt;&lt;electronic-resource-num&gt;10.1021/acsphotonics.4c01789&lt;/electronic-resource-num&gt;&lt;/record&gt;&lt;/Cite&gt;&lt;/EndNote&gt;</w:instrText>
+        <w:instrText xml:space="preserve"> ADDIN EN.CITE &lt;EndNote&gt;&lt;Cite&gt;&lt;Author&gt;Blundell&lt;/Author&gt;&lt;Year&gt;2025&lt;/Year&gt;&lt;RecNum&gt;25&lt;/RecNum&gt;&lt;DisplayText&gt;[7]&lt;/DisplayText&gt;&lt;record&gt;&lt;rec-number&gt;25&lt;/rec-number&gt;&lt;foreign-keys&gt;&lt;key app="EN" db-id="v920pft06rp9dbex2ap500x99x5rrtswxzss" timestamp="1768016463" guid="83165567-b35a-4cd6-aa63-d20c0019cf44"&gt;25&lt;/key&gt;&lt;/foreign-keys&gt;&lt;ref-type name="Journal Article"&gt;17&lt;/ref-type&gt;&lt;contributors&gt;&lt;authors&gt;&lt;author&gt;Blundell, Sophie&lt;/author&gt;&lt;author&gt;Radford, Thomas W.&lt;/author&gt;&lt;author&gt;Ajia, Idris A.&lt;/author&gt;&lt;author&gt;Lawson, Daniel&lt;/author&gt;&lt;author&gt;Yan, Xingzhao&lt;/author&gt;&lt;author&gt;Banakar, Mehdi&lt;/author&gt;&lt;author&gt;Thomson, David J.&lt;/author&gt;&lt;author&gt;Zeimpekis, Ioannis&lt;/author&gt;&lt;author&gt;Muskens, Otto L.&lt;/author&gt;&lt;/authors&gt;&lt;/contributors&gt;&lt;titles&gt;&lt;title&gt;Ultracompact Programmable Silicon Photonics Using Layers of Low-Loss Phase-Change Material Sb2Se3 of Increasing Thickness&lt;/title&gt;&lt;secondary-title&gt;ACS Photonics&lt;/secondary-title&gt;&lt;/titles&gt;&lt;periodical&gt;&lt;full-title&gt;ACS Photonics&lt;/full-title&gt;&lt;/periodical&gt;&lt;pages&gt;1382-1391&lt;/pages&gt;&lt;volume&gt;12&lt;/volume&gt;&lt;number&gt;3&lt;/number&gt;&lt;dates&gt;&lt;year&gt;2025&lt;/year&gt;&lt;pub-dates&gt;&lt;date&gt;2025/03/19&lt;/date&gt;&lt;/pub-dates&gt;&lt;/dates&gt;&lt;publisher&gt;American Chemical Society&lt;/publisher&gt;&lt;urls&gt;&lt;related-urls&gt;&lt;url&gt;https://doi.org/10.1021/acsphotonics.4c01789&lt;/url&gt;&lt;/related-urls&gt;&lt;/urls&gt;&lt;electronic-resource-num&gt;10.1021/acsphotonics.4c01789&lt;/electronic-resource-num&gt;&lt;/record&gt;&lt;/Cite&gt;&lt;/EndNote&gt;</w:instrText>
       </w:r>
       <w:r>
         <w:rPr>
@@ -7914,7 +8922,7 @@
           <w:sz w:val="22"/>
           <w:szCs w:val="22"/>
         </w:rPr>
-        <w:t>[1]</w:t>
+        <w:t>[7]</w:t>
       </w:r>
       <w:r>
         <w:rPr>
@@ -8255,6 +9263,15 @@
           <w:szCs w:val="22"/>
         </w:rPr>
         <w:t>We add sentences about finite-thickness effects</w:t>
+      </w:r>
+      <w:r>
+        <w:rPr>
+          <w:rFonts w:ascii="Calibri" w:hAnsi="Calibri"/>
+          <w:bCs/>
+          <w:sz w:val="22"/>
+          <w:szCs w:val="22"/>
+        </w:rPr>
+        <w:t xml:space="preserve"> and add other simulation work that model this effect in “IV.E. LIMITATIONS AND FUTURE WORK SUGGESTIONS”.</w:t>
       </w:r>
     </w:p>
     <w:p>
@@ -8546,7 +9563,19 @@
           <w:sz w:val="22"/>
           <w:szCs w:val="22"/>
         </w:rPr>
-        <w:t>For 93.6% transmission, the insertion loss is ~ IL = -10 log10(0.936) ~ 0.3 dB. However, Fig. 8 reports insertion loss evolution relative to the initial state, not absolute insertion loss. The authors should also report</w:t>
+        <w:t xml:space="preserve">For 93.6% transmission, the insertion loss is ~ IL = -10 log10(0.936) ~ 0.3 dB. However, Fig. 8 reports insertion loss evolution relative to the initial state, not absolute insertion loss. The authors should also </w:t>
+      </w:r>
+      <w:proofErr w:type="gramStart"/>
+      <w:r>
+        <w:rPr>
+          <w:rFonts w:ascii="Calibri" w:hAnsi="Calibri"/>
+          <w:b/>
+          <w:bCs/>
+          <w:color w:val="008000"/>
+          <w:sz w:val="22"/>
+          <w:szCs w:val="22"/>
+        </w:rPr>
+        <w:t>report</w:t>
       </w:r>
       <w:r>
         <w:rPr>
@@ -8559,6 +9588,7 @@
         </w:rPr>
         <w:t>:</w:t>
       </w:r>
+      <w:proofErr w:type="gramEnd"/>
       <w:r>
         <w:rPr>
           <w:rFonts w:ascii="Calibri" w:hAnsi="Calibri"/>
@@ -8777,7 +9807,19 @@
           <w:sz w:val="22"/>
           <w:szCs w:val="22"/>
         </w:rPr>
-        <w:t>Motivation of the presented work is missing in the introduction and abstract. The authors state Sb2Se3 has not been explored much, but the paper cites recent Sb2Se3 optical filter studies and does not quantitatively compare against them. How does this paper stand out from recent work?</w:t>
+        <w:t xml:space="preserve">Motivation of the presented work is missing in the introduction and abstract. The authors state Sb2Se3 has not been explored much, but the paper cites recent Sb2Se3 optical filter </w:t>
+      </w:r>
+      <w:r>
+        <w:rPr>
+          <w:rFonts w:ascii="Calibri" w:hAnsi="Calibri"/>
+          <w:b/>
+          <w:bCs/>
+          <w:color w:val="008000"/>
+          <w:sz w:val="22"/>
+          <w:szCs w:val="22"/>
+        </w:rPr>
+        <w:lastRenderedPageBreak/>
+        <w:t>studies and does not quantitatively compare against them. How does this paper stand out from recent work?</w:t>
       </w:r>
     </w:p>
     <w:p>
@@ -8946,7 +9988,6 @@
           <w:sz w:val="22"/>
           <w:szCs w:val="22"/>
         </w:rPr>
-        <w:lastRenderedPageBreak/>
         <w:t>Author re</w:t>
       </w:r>
       <w:r>
@@ -9101,7 +10142,7 @@
           <w:szCs w:val="28"/>
           <w:lang w:bidi="th-TH"/>
         </w:rPr>
-        <w:t>Thank you for the detailed responses and interesting points.</w:t>
+        <w:t>We would like to thank the reviewer for their interests, detailed and fair responses.</w:t>
       </w:r>
     </w:p>
     <w:p>
@@ -9752,7 +10793,6 @@
           <w:sz w:val="22"/>
           <w:szCs w:val="22"/>
         </w:rPr>
-        <w:lastRenderedPageBreak/>
         <w:t>Author action:</w:t>
       </w:r>
       <w:r>
@@ -10472,33 +11512,46 @@
           <w:rFonts w:ascii="Calibri" w:hAnsi="Calibri"/>
           <w:b/>
           <w:bCs/>
-          <w:color w:val="008000"/>
-          <w:sz w:val="22"/>
-          <w:szCs w:val="22"/>
-        </w:rPr>
-        <w:t>Reviewer#</w:t>
-      </w:r>
-      <w:r>
-        <w:rPr>
-          <w:rFonts w:ascii="Calibri" w:hAnsi="Calibri"/>
-          <w:b/>
-          <w:bCs/>
-          <w:color w:val="008000"/>
-          <w:sz w:val="22"/>
-          <w:szCs w:val="22"/>
-        </w:rPr>
-        <w:t xml:space="preserve">5, Concern # 6 (Q7: </w:t>
-      </w:r>
-      <w:r>
-        <w:rPr>
-          <w:rFonts w:ascii="Calibri" w:hAnsi="Calibri"/>
-          <w:b/>
-          <w:bCs/>
-          <w:color w:val="008000"/>
-          <w:sz w:val="22"/>
-          <w:szCs w:val="22"/>
-        </w:rPr>
-        <w:t>On the incident angle/polarization data (Fig. 7), The paper notes TM polarization causes a "significant blueshift" at higher incident angles but does not quantify this shift numerically. Could the authors report the specific magnitude of the blueshift (in nm) at, say, 45° and 60° for both the 4- and 5-unit-cell designs?</w:t>
+          <w:strike/>
+          <w:color w:val="008000"/>
+          <w:sz w:val="22"/>
+          <w:szCs w:val="22"/>
+        </w:rPr>
+        <w:t>Reviewer#5, Concern # 6</w:t>
+      </w:r>
+      <w:r>
+        <w:rPr>
+          <w:rFonts w:ascii="Calibri" w:hAnsi="Calibri"/>
+          <w:b/>
+          <w:bCs/>
+          <w:color w:val="008000"/>
+          <w:sz w:val="22"/>
+          <w:szCs w:val="22"/>
+        </w:rPr>
+        <w:t xml:space="preserve"> (Q7: </w:t>
+      </w:r>
+      <w:r>
+        <w:rPr>
+          <w:rFonts w:ascii="Calibri" w:hAnsi="Calibri"/>
+          <w:b/>
+          <w:bCs/>
+          <w:color w:val="008000"/>
+          <w:sz w:val="22"/>
+          <w:szCs w:val="22"/>
+        </w:rPr>
+        <w:t xml:space="preserve">On the incident angle/polarization data (Fig. 7), The paper notes TM polarization causes a "significant blueshift" at higher incident angles but does not quantify this shift </w:t>
+      </w:r>
+      <w:r>
+        <w:rPr>
+          <w:rFonts w:ascii="Calibri" w:hAnsi="Calibri"/>
+          <w:b/>
+          <w:bCs/>
+          <w:color w:val="008000"/>
+          <w:sz w:val="22"/>
+          <w:szCs w:val="22"/>
+        </w:rPr>
+        <w:lastRenderedPageBreak/>
+        <w:t>numerically. Could the authors report the specific magnitude of the blueshift (in nm) at, say, 45° and 60° for both the 4- and 5-unit-cell designs?</w:t>
       </w:r>
       <w:r>
         <w:rPr>
@@ -10630,16 +11683,7 @@
           <w:sz w:val="22"/>
           <w:szCs w:val="22"/>
         </w:rPr>
-        <w:t xml:space="preserve">At higher incident angle, the high-ΔT spectral profile (yellow-green) shifted to shorter wavelengths. For TE polarized light, the blueshift of wavelength with the highest ΔT at 45° compared to 0° incident angle are -37 and -57 nm for 4-unit-cell and 5-unit-cell designs, respectively. And at 60° angles the blueshift are -90, -143 nm, respectively. As for TM polarized light, the peak ΔT blueshift in 4-unit-cell and 5-unit-cell designs at 45° are -103 and -168 nm, respectively. At 60° </w:t>
-      </w:r>
-      <w:r>
-        <w:rPr>
-          <w:rFonts w:ascii="Calibri" w:hAnsi="Calibri"/>
-          <w:sz w:val="22"/>
-          <w:szCs w:val="22"/>
-        </w:rPr>
-        <w:lastRenderedPageBreak/>
-        <w:t>incident angles they are -156 and -226 nm, respectively. It can be seen that the ΔT profile of both polarization modes blue shifted with increasing incident angle, with TM polarization causing longer blueshift.</w:t>
+        <w:t>At higher incident angle, the high-ΔT spectral profile (yellow-green) shifted to shorter wavelengths. For TE polarized light, the blueshift of wavelength with the highest ΔT at 45° compared to 0° incident angle are -37 and -57 nm for 4-unit-cell and 5-unit-cell designs, respectively. And at 60° angles the blueshift are -90, -143 nm, respectively. As for TM polarized light, the peak ΔT blueshift in 4-unit-cell and 5-unit-cell designs at 45° are -103 and -168 nm, respectively. At 60° incident angles they are -156 and -226 nm, respectively. It can be seen that the ΔT profile of both polarization modes blue shifted with increasing incident angle, with TM polarization causing longer blueshift.</w:t>
       </w:r>
       <w:r>
         <w:rPr>
@@ -10746,6 +11790,7 @@
     <w:p>
       <w:pPr>
         <w:pStyle w:val="EndNoteBibliography"/>
+        <w:spacing w:after="0"/>
         <w:ind w:left="720" w:hanging="720"/>
       </w:pPr>
       <w:r>
@@ -10777,6 +11822,172 @@
       </w:r>
       <w:r>
         <w:t>[1]</w:t>
+      </w:r>
+      <w:r>
+        <w:tab/>
+        <w:t>M. Cui</w:t>
+      </w:r>
+      <w:r>
+        <w:rPr>
+          <w:i/>
+        </w:rPr>
+        <w:t xml:space="preserve"> et al.</w:t>
+      </w:r>
+      <w:r>
+        <w:t xml:space="preserve">, "Tunable multi-channel optical filter based on the near-infrared ultralow-loss phase change material Sb2Se3," </w:t>
+      </w:r>
+      <w:r>
+        <w:rPr>
+          <w:i/>
+        </w:rPr>
+        <w:t xml:space="preserve">Opt. Express, </w:t>
+      </w:r>
+      <w:r>
+        <w:t>vol. 34, no. 5, pp. 7378–7387, 2026/03/09 2026, doi: 10.1364/OE.586098.</w:t>
+      </w:r>
+    </w:p>
+    <w:p>
+      <w:pPr>
+        <w:pStyle w:val="EndNoteBibliography"/>
+        <w:spacing w:after="0"/>
+        <w:ind w:left="720" w:hanging="720"/>
+      </w:pPr>
+      <w:r>
+        <w:t>[2]</w:t>
+      </w:r>
+      <w:r>
+        <w:tab/>
+        <w:t>Y. Liu</w:t>
+      </w:r>
+      <w:r>
+        <w:rPr>
+          <w:i/>
+        </w:rPr>
+        <w:t xml:space="preserve"> et al.</w:t>
+      </w:r>
+      <w:r>
+        <w:t xml:space="preserve">, "Design of near-infrared solid-state tunable Fabry-Perot filters based on VO2/P4VP films," </w:t>
+      </w:r>
+      <w:r>
+        <w:rPr>
+          <w:i/>
+        </w:rPr>
+        <w:t xml:space="preserve">Opt. Express, </w:t>
+      </w:r>
+      <w:r>
+        <w:t>vol. 32, no. 19, pp. 32585–32596, 2024/09/09 2024, doi: 10.1364/OE.530226.</w:t>
+      </w:r>
+    </w:p>
+    <w:p>
+      <w:pPr>
+        <w:pStyle w:val="EndNoteBibliography"/>
+        <w:spacing w:after="0"/>
+        <w:ind w:left="720" w:hanging="720"/>
+      </w:pPr>
+      <w:r>
+        <w:t>[3]</w:t>
+      </w:r>
+      <w:r>
+        <w:tab/>
+        <w:t xml:space="preserve">R. Heenkenda, K. Hirakawa, and A. Sarangan, "Tunable optical filter using phase change materials for smart IR night vision applications," </w:t>
+      </w:r>
+      <w:r>
+        <w:rPr>
+          <w:i/>
+        </w:rPr>
+        <w:t xml:space="preserve">Opt. Express, </w:t>
+      </w:r>
+      <w:r>
+        <w:t>vol. 29, no. 21, pp. 33795–33803, 2021/10/11 2021, doi: 10.1364/OE.440299.</w:t>
+      </w:r>
+    </w:p>
+    <w:p>
+      <w:pPr>
+        <w:pStyle w:val="EndNoteBibliography"/>
+        <w:spacing w:after="0"/>
+        <w:ind w:left="720" w:hanging="720"/>
+      </w:pPr>
+      <w:r>
+        <w:t>[4]</w:t>
+      </w:r>
+      <w:r>
+        <w:tab/>
+        <w:t xml:space="preserve">Q. Zhang, Q. Hong, and Z. Zhu, "Low-loss Optical Switching Based on Phase-change Material Sb2Se3 in a Micro-ring Resonator," </w:t>
+      </w:r>
+      <w:r>
+        <w:rPr>
+          <w:i/>
+        </w:rPr>
+        <w:t xml:space="preserve">Journal of Physics: Conference Series, </w:t>
+      </w:r>
+      <w:r>
+        <w:t>vol. 2597, p. 012020, 09/01 2023, doi: 10.1088/1742-6596/2597/1/012020.</w:t>
+      </w:r>
+    </w:p>
+    <w:p>
+      <w:pPr>
+        <w:pStyle w:val="EndNoteBibliography"/>
+        <w:spacing w:after="0"/>
+        <w:ind w:left="720" w:hanging="720"/>
+      </w:pPr>
+      <w:r>
+        <w:t>[5]</w:t>
+      </w:r>
+      <w:r>
+        <w:tab/>
+        <w:t xml:space="preserve">A. Sarangan, J. Duran, V. Vasilyev, N. Limberopoulos, I. Vitebskiy, and I. Anisimov, "Broadband Reflective Optical Limiter Using GST Phase Change Material," </w:t>
+      </w:r>
+      <w:r>
+        <w:rPr>
+          <w:i/>
+        </w:rPr>
+        <w:t xml:space="preserve">IEEE Photonics Journal, </w:t>
+      </w:r>
+      <w:r>
+        <w:t>vol. 10, no. 2, pp. 1–9, 2018, doi: 10.1109/jphot.2018.2796448.</w:t>
+      </w:r>
+    </w:p>
+    <w:p>
+      <w:pPr>
+        <w:pStyle w:val="EndNoteBibliography"/>
+        <w:spacing w:after="0"/>
+        <w:ind w:left="720" w:hanging="720"/>
+      </w:pPr>
+      <w:r>
+        <w:t>[6]</w:t>
+      </w:r>
+      <w:r>
+        <w:tab/>
+        <w:t xml:space="preserve">R. Patel, N. Patel, N. Bazzanella, and A. Miotello, "Fabricating multilayer antireflective coating for near complete transmittance in broadband visible light spectrum," </w:t>
+      </w:r>
+      <w:r>
+        <w:rPr>
+          <w:i/>
+        </w:rPr>
+        <w:t xml:space="preserve">Optical Materials, </w:t>
+      </w:r>
+      <w:r>
+        <w:t xml:space="preserve">vol. 108, p. 110415, 2020/10/01/ 2020, doi: </w:t>
+      </w:r>
+      <w:hyperlink r:id="rId9" w:history="1">
+        <w:r>
+          <w:rPr>
+            <w:rStyle w:val="Hyperlink"/>
+          </w:rPr>
+          <w:t>https://doi.org/10.1016/j.optmat.2020.110415</w:t>
+        </w:r>
+      </w:hyperlink>
+      <w:r>
+        <w:t>.</w:t>
+      </w:r>
+    </w:p>
+    <w:p>
+      <w:pPr>
+        <w:pStyle w:val="EndNoteBibliography"/>
+        <w:ind w:left="720" w:hanging="720"/>
+      </w:pPr>
+      <w:r>
+        <w:t>[7]</w:t>
       </w:r>
       <w:r>
         <w:tab/>
@@ -10832,7 +12043,7 @@
 </file>
 
 <file path=word/numbering.xml><?xml version="1.0" encoding="utf-8"?>
-<w:numbering xmlns:wpc="http://schemas.microsoft.com/office/word/2010/wordprocessingCanvas" xmlns:cx="http://schemas.microsoft.com/office/drawing/2014/chartex" xmlns:cx1="http://schemas.microsoft.com/office/drawing/2015/9/8/chartex" xmlns:cx2="http://schemas.microsoft.com/office/drawing/2015/10/21/chartex" xmlns:cx3="http://schemas.microsoft.com/office/drawing/2016/5/9/chartex" xmlns:cx4="http://schemas.microsoft.com/office/drawing/2016/5/10/chartex" xmlns:cx5="http://schemas.microsoft.com/office/drawing/2016/5/11/chartex" xmlns:cx6="http://schemas.microsoft.com/office/drawing/2016/5/12/chartex" xmlns:cx7="http://schemas.microsoft.com/office/drawing/2016/5/13/chartex" xmlns:cx8="http://schemas.microsoft.com/office/drawing/2016/5/14/chartex" xmlns:mc="http://schemas.openxmlformats.org/markup-compatibility/2006" xmlns:aink="http://schemas.microsoft.com/office/drawing/2016/ink" xmlns:am3d="http://schemas.microsoft.com/office/drawing/2017/model3d" xmlns:o="urn:schemas-microsoft-com:office:office" xmlns:oel="http://schemas.microsoft.com/office/2019/extlst" xmlns:r="http://schemas.openxmlformats.org/officeDocument/2006/relationships" xmlns:m="http://schemas.openxmlformats.org/officeDocument/2006/math" xmlns:v="urn:schemas-microsoft-com:vml" xmlns:wp14="http://schemas.microsoft.com/office/word/2010/wordprocessingDrawing" xmlns:wp="http://schemas.openxmlformats.org/drawingml/2006/wordprocessingDrawing" xmlns:w10="urn:schemas-microsoft-com:office:word" xmlns:w="http://schemas.openxmlformats.org/wordprocessingml/2006/main" xmlns:w14="http://schemas.microsoft.com/office/word/2010/wordml" xmlns:w15="http://schemas.microsoft.com/office/word/2012/wordml" xmlns:w16cex="http://schemas.microsoft.com/office/word/2018/wordml/cex" xmlns:w16cid="http://schemas.microsoft.com/office/word/2016/wordml/cid" xmlns:w16="http://schemas.microsoft.com/office/word/2018/wordml" xmlns:w16du="http://schemas.microsoft.com/office/word/2023/wordml/word16du" xmlns:w16sdtdh="http://schemas.microsoft.com/office/word/2020/wordml/sdtdatahash" xmlns:w16sdtfl="http://schemas.microsoft.com/office/word/2024/wordml/sdtformatlock" xmlns:w16se="http://schemas.microsoft.com/office/word/2015/wordml/symex" xmlns:wpg="http://schemas.microsoft.com/office/word/2010/wordprocessingGroup" xmlns:wpi="http://schemas.microsoft.com/office/word/2010/wordprocessingInk" xmlns:wne="http://schemas.microsoft.com/office/word/2006/wordml" xmlns:wps="http://schemas.microsoft.com/office/word/2010/wordprocessingShape" mc:Ignorable="w14 w15 w16se w16cid w16 w16cex w16sdtdh w16sdtfl w16du wp14">
+<w:numbering xmlns:wpc="http://schemas.microsoft.com/office/word/2010/wordprocessingCanvas" xmlns:cx="http://schemas.microsoft.com/office/drawing/2014/chartex" xmlns:cx1="http://schemas.microsoft.com/office/drawing/2015/9/8/chartex" xmlns:cx2="http://schemas.microsoft.com/office/drawing/2015/10/21/chartex" xmlns:cx3="http://schemas.microsoft.com/office/drawing/2016/5/9/chartex" xmlns:cx4="http://schemas.microsoft.com/office/drawing/2016/5/10/chartex" xmlns:cx5="http://schemas.microsoft.com/office/drawing/2016/5/11/chartex" xmlns:cx6="http://schemas.microsoft.com/office/drawing/2016/5/12/chartex" xmlns:cx7="http://schemas.microsoft.com/office/drawing/2016/5/13/chartex" xmlns:cx8="http://schemas.microsoft.com/office/drawing/2016/5/14/chartex" xmlns:mc="http://schemas.openxmlformats.org/markup-compatibility/2006" xmlns:aink="http://schemas.microsoft.com/office/drawing/2016/ink" xmlns:am3d="http://schemas.microsoft.com/office/drawing/2017/model3d" xmlns:o="urn:schemas-microsoft-com:office:office" xmlns:oel="http://schemas.microsoft.com/office/2019/extlst" xmlns:r="http://schemas.openxmlformats.org/officeDocument/2006/relationships" xmlns:m="http://schemas.openxmlformats.org/officeDocument/2006/math" xmlns:v="urn:schemas-microsoft-com:vml" xmlns:wp14="http://schemas.microsoft.com/office/word/2010/wordprocessingDrawing" xmlns:wp="http://schemas.openxmlformats.org/drawingml/2006/wordprocessingDrawing" xmlns:w10="urn:schemas-microsoft-com:office:word" xmlns:w="http://schemas.openxmlformats.org/wordprocessingml/2006/main" xmlns:w14="http://schemas.microsoft.com/office/word/2010/wordml" xmlns:w15="http://schemas.microsoft.com/office/word/2012/wordml" xmlns:w16cei="http://schemas.microsoft.com/office/word/2026/wordml/cei" xmlns:w16cex="http://schemas.microsoft.com/office/word/2018/wordml/cex" xmlns:w16cid="http://schemas.microsoft.com/office/word/2016/wordml/cid" xmlns:w16="http://schemas.microsoft.com/office/word/2018/wordml" xmlns:w16du="http://schemas.microsoft.com/office/word/2023/wordml/word16du" xmlns:w16sdtdh="http://schemas.microsoft.com/office/word/2020/wordml/sdtdatahash" xmlns:w16sdtfl="http://schemas.microsoft.com/office/word/2024/wordml/sdtformatlock" xmlns:w16se="http://schemas.microsoft.com/office/word/2015/wordml/symex" xmlns:wpg="http://schemas.microsoft.com/office/word/2010/wordprocessingGroup" xmlns:wpi="http://schemas.microsoft.com/office/word/2010/wordprocessingInk" xmlns:wne="http://schemas.microsoft.com/office/word/2006/wordml" xmlns:wps="http://schemas.microsoft.com/office/word/2010/wordprocessingShape" mc:Ignorable="w14 w15 w16se w16cid w16 w16cex w16sdtdh w16sdtfl w16du wp14">
   <w:abstractNum w:abstractNumId="0" w15:restartNumberingAfterBreak="0">
     <w:nsid w:val="FFFFFF1D"/>
     <w:multiLevelType w:val="multilevel"/>
@@ -11371,7 +12582,7 @@
   <w:style w:type="paragraph" w:default="1" w:styleId="Normal">
     <w:name w:val="Normal"/>
     <w:qFormat/>
-    <w:rsid w:val="004675DD"/>
+    <w:rsid w:val="00FE4007"/>
     <w:pPr>
       <w:spacing w:after="200"/>
     </w:pPr>
@@ -11383,7 +12594,6 @@
   <w:style w:type="character" w:default="1" w:styleId="DefaultParagraphFont">
     <w:name w:val="Default Paragraph Font"/>
     <w:uiPriority w:val="1"/>
-    <w:semiHidden/>
     <w:unhideWhenUsed/>
   </w:style>
   <w:style w:type="table" w:default="1" w:styleId="TableNormal">

</xml_diff>